<commit_message>
docs: re-shoot the MANAGER screenshots without the modelling links
All 44 manager shots (11 per locale) now show the MANAGER sidebar without
Business Areas, Folders, Items, Joins and Hierarchies. The 8 MANAGER .docx
manuals are rebuilt from them. The shot script now searches for
GD_M.M10_V01.DIS before copying or sharing it: the original is past the
first page of 900+ maps once no earlier copies sit on top.

Co-Authored-By: Claude Opus 5.5 <noreply@anthropic.com>
</commit_message>
<xml_diff>
--- a/discoverer-neo/docs/user-guide/manual/Discoverer-Neo-MANAGER-Guide-Full-en.docx
+++ b/discoverer-neo/docs/user-guide/manual/Discoverer-Neo-MANAGER-Guide-Full-en.docx
@@ -74,7 +74,7 @@
     <w:sdt>
       <w:sdtPr>
         <w:alias w:val="Contents"/>
-        <w:id w:val="-1648513116"/>
+        <w:id w:val="-1039049282"/>
       </w:sdtPr>
       <w:sdtEndPr/>
       <w:sdtContent>
@@ -102,7 +102,7 @@
           <w:r>
             <w:fldChar w:fldCharType="separate"/>
           </w:r>
-          <w:hyperlink w:anchor="_Toc241691981" w:history="1">
+          <w:hyperlink w:anchor="_Toc241692593" w:history="1">
             <w:r>
               <w:rPr>
                 <w:rStyle w:val="Hiperligao"/>
@@ -126,7 +126,7 @@
               <w:rPr>
                 <w:noProof/>
               </w:rPr>
-              <w:instrText xml:space="preserve"> PAGEREF _Toc241691981 \h </w:instrText>
+              <w:instrText xml:space="preserve"> PAGEREF _Toc241692593 \h </w:instrText>
             </w:r>
             <w:r>
               <w:rPr>
@@ -168,7 +168,7 @@
               <w14:ligatures w14:val="standardContextual"/>
             </w:rPr>
           </w:pPr>
-          <w:hyperlink w:anchor="_Toc241691982" w:history="1">
+          <w:hyperlink w:anchor="_Toc241692594" w:history="1">
             <w:r>
               <w:rPr>
                 <w:rStyle w:val="Hiperligao"/>
@@ -192,7 +192,7 @@
               <w:rPr>
                 <w:noProof/>
               </w:rPr>
-              <w:instrText xml:space="preserve"> PAGEREF _Toc241691982 \h </w:instrText>
+              <w:instrText xml:space="preserve"> PAGEREF _Toc241692594 \h </w:instrText>
             </w:r>
             <w:r>
               <w:rPr>
@@ -234,7 +234,7 @@
               <w14:ligatures w14:val="standardContextual"/>
             </w:rPr>
           </w:pPr>
-          <w:hyperlink w:anchor="_Toc241691983" w:history="1">
+          <w:hyperlink w:anchor="_Toc241692595" w:history="1">
             <w:r>
               <w:rPr>
                 <w:rStyle w:val="Hiperligao"/>
@@ -258,7 +258,7 @@
               <w:rPr>
                 <w:noProof/>
               </w:rPr>
-              <w:instrText xml:space="preserve"> PAGEREF _Toc241691983 \h </w:instrText>
+              <w:instrText xml:space="preserve"> PAGEREF _Toc241692595 \h </w:instrText>
             </w:r>
             <w:r>
               <w:rPr>
@@ -300,7 +300,7 @@
               <w14:ligatures w14:val="standardContextual"/>
             </w:rPr>
           </w:pPr>
-          <w:hyperlink w:anchor="_Toc241691984" w:history="1">
+          <w:hyperlink w:anchor="_Toc241692596" w:history="1">
             <w:r>
               <w:rPr>
                 <w:rStyle w:val="Hiperligao"/>
@@ -324,7 +324,7 @@
               <w:rPr>
                 <w:noProof/>
               </w:rPr>
-              <w:instrText xml:space="preserve"> PAGEREF _Toc241691984 \h </w:instrText>
+              <w:instrText xml:space="preserve"> PAGEREF _Toc241692596 \h </w:instrText>
             </w:r>
             <w:r>
               <w:rPr>
@@ -366,7 +366,7 @@
               <w14:ligatures w14:val="standardContextual"/>
             </w:rPr>
           </w:pPr>
-          <w:hyperlink w:anchor="_Toc241691985" w:history="1">
+          <w:hyperlink w:anchor="_Toc241692597" w:history="1">
             <w:r>
               <w:rPr>
                 <w:rStyle w:val="Hiperligao"/>
@@ -390,7 +390,7 @@
               <w:rPr>
                 <w:noProof/>
               </w:rPr>
-              <w:instrText xml:space="preserve"> PAGEREF _Toc241691985 \h </w:instrText>
+              <w:instrText xml:space="preserve"> PAGEREF _Toc241692597 \h </w:instrText>
             </w:r>
             <w:r>
               <w:rPr>
@@ -432,7 +432,7 @@
               <w14:ligatures w14:val="standardContextual"/>
             </w:rPr>
           </w:pPr>
-          <w:hyperlink w:anchor="_Toc241691986" w:history="1">
+          <w:hyperlink w:anchor="_Toc241692598" w:history="1">
             <w:r>
               <w:rPr>
                 <w:rStyle w:val="Hiperligao"/>
@@ -456,7 +456,7 @@
               <w:rPr>
                 <w:noProof/>
               </w:rPr>
-              <w:instrText xml:space="preserve"> PAGEREF _Toc241691986 \h </w:instrText>
+              <w:instrText xml:space="preserve"> PAGEREF _Toc241692598 \h </w:instrText>
             </w:r>
             <w:r>
               <w:rPr>
@@ -498,7 +498,7 @@
               <w14:ligatures w14:val="standardContextual"/>
             </w:rPr>
           </w:pPr>
-          <w:hyperlink w:anchor="_Toc241691987" w:history="1">
+          <w:hyperlink w:anchor="_Toc241692599" w:history="1">
             <w:r>
               <w:rPr>
                 <w:rStyle w:val="Hiperligao"/>
@@ -522,7 +522,7 @@
               <w:rPr>
                 <w:noProof/>
               </w:rPr>
-              <w:instrText xml:space="preserve"> PAGEREF _Toc241691987 \h </w:instrText>
+              <w:instrText xml:space="preserve"> PAGEREF _Toc241692599 \h </w:instrText>
             </w:r>
             <w:r>
               <w:rPr>
@@ -564,7 +564,7 @@
               <w14:ligatures w14:val="standardContextual"/>
             </w:rPr>
           </w:pPr>
-          <w:hyperlink w:anchor="_Toc241691988" w:history="1">
+          <w:hyperlink w:anchor="_Toc241692600" w:history="1">
             <w:r>
               <w:rPr>
                 <w:rStyle w:val="Hiperligao"/>
@@ -588,7 +588,7 @@
               <w:rPr>
                 <w:noProof/>
               </w:rPr>
-              <w:instrText xml:space="preserve"> PAGEREF _Toc241691988 \h </w:instrText>
+              <w:instrText xml:space="preserve"> PAGEREF _Toc241692600 \h </w:instrText>
             </w:r>
             <w:r>
               <w:rPr>
@@ -630,7 +630,7 @@
               <w14:ligatures w14:val="standardContextual"/>
             </w:rPr>
           </w:pPr>
-          <w:hyperlink w:anchor="_Toc241691989" w:history="1">
+          <w:hyperlink w:anchor="_Toc241692601" w:history="1">
             <w:r>
               <w:rPr>
                 <w:rStyle w:val="Hiperligao"/>
@@ -654,7 +654,7 @@
               <w:rPr>
                 <w:noProof/>
               </w:rPr>
-              <w:instrText xml:space="preserve"> PAGEREF _Toc241691989 \h </w:instrText>
+              <w:instrText xml:space="preserve"> PAGEREF _Toc241692601 \h </w:instrText>
             </w:r>
             <w:r>
               <w:rPr>
@@ -696,7 +696,7 @@
               <w14:ligatures w14:val="standardContextual"/>
             </w:rPr>
           </w:pPr>
-          <w:hyperlink w:anchor="_Toc241691990" w:history="1">
+          <w:hyperlink w:anchor="_Toc241692602" w:history="1">
             <w:r>
               <w:rPr>
                 <w:rStyle w:val="Hiperligao"/>
@@ -720,7 +720,7 @@
               <w:rPr>
                 <w:noProof/>
               </w:rPr>
-              <w:instrText xml:space="preserve"> PAGEREF _Toc241691990 \h </w:instrText>
+              <w:instrText xml:space="preserve"> PAGEREF _Toc241692602 \h </w:instrText>
             </w:r>
             <w:r>
               <w:rPr>
@@ -762,7 +762,7 @@
               <w14:ligatures w14:val="standardContextual"/>
             </w:rPr>
           </w:pPr>
-          <w:hyperlink w:anchor="_Toc241691991" w:history="1">
+          <w:hyperlink w:anchor="_Toc241692603" w:history="1">
             <w:r>
               <w:rPr>
                 <w:rStyle w:val="Hiperligao"/>
@@ -786,7 +786,7 @@
               <w:rPr>
                 <w:noProof/>
               </w:rPr>
-              <w:instrText xml:space="preserve"> PAGEREF _Toc241691991 \h </w:instrText>
+              <w:instrText xml:space="preserve"> PAGEREF _Toc241692603 \h </w:instrText>
             </w:r>
             <w:r>
               <w:rPr>
@@ -828,7 +828,7 @@
               <w14:ligatures w14:val="standardContextual"/>
             </w:rPr>
           </w:pPr>
-          <w:hyperlink w:anchor="_Toc241691992" w:history="1">
+          <w:hyperlink w:anchor="_Toc241692604" w:history="1">
             <w:r>
               <w:rPr>
                 <w:rStyle w:val="Hiperligao"/>
@@ -852,7 +852,7 @@
               <w:rPr>
                 <w:noProof/>
               </w:rPr>
-              <w:instrText xml:space="preserve"> PAGEREF _Toc241691992 \h </w:instrText>
+              <w:instrText xml:space="preserve"> PAGEREF _Toc241692604 \h </w:instrText>
             </w:r>
             <w:r>
               <w:rPr>
@@ -894,7 +894,7 @@
               <w14:ligatures w14:val="standardContextual"/>
             </w:rPr>
           </w:pPr>
-          <w:hyperlink w:anchor="_Toc241691993" w:history="1">
+          <w:hyperlink w:anchor="_Toc241692605" w:history="1">
             <w:r>
               <w:rPr>
                 <w:rStyle w:val="Hiperligao"/>
@@ -918,7 +918,7 @@
               <w:rPr>
                 <w:noProof/>
               </w:rPr>
-              <w:instrText xml:space="preserve"> PAGEREF _Toc241691993 \h </w:instrText>
+              <w:instrText xml:space="preserve"> PAGEREF _Toc241692605 \h </w:instrText>
             </w:r>
             <w:r>
               <w:rPr>
@@ -960,7 +960,7 @@
               <w14:ligatures w14:val="standardContextual"/>
             </w:rPr>
           </w:pPr>
-          <w:hyperlink w:anchor="_Toc241691994" w:history="1">
+          <w:hyperlink w:anchor="_Toc241692606" w:history="1">
             <w:r>
               <w:rPr>
                 <w:rStyle w:val="Hiperligao"/>
@@ -984,7 +984,7 @@
               <w:rPr>
                 <w:noProof/>
               </w:rPr>
-              <w:instrText xml:space="preserve"> PAGEREF _Toc241691994 \h </w:instrText>
+              <w:instrText xml:space="preserve"> PAGEREF _Toc241692606 \h </w:instrText>
             </w:r>
             <w:r>
               <w:rPr>
@@ -1026,7 +1026,7 @@
               <w14:ligatures w14:val="standardContextual"/>
             </w:rPr>
           </w:pPr>
-          <w:hyperlink w:anchor="_Toc241691995" w:history="1">
+          <w:hyperlink w:anchor="_Toc241692607" w:history="1">
             <w:r>
               <w:rPr>
                 <w:rStyle w:val="Hiperligao"/>
@@ -1050,7 +1050,7 @@
               <w:rPr>
                 <w:noProof/>
               </w:rPr>
-              <w:instrText xml:space="preserve"> PAGEREF _Toc241691995 \h </w:instrText>
+              <w:instrText xml:space="preserve"> PAGEREF _Toc241692607 \h </w:instrText>
             </w:r>
             <w:r>
               <w:rPr>
@@ -1092,7 +1092,7 @@
               <w14:ligatures w14:val="standardContextual"/>
             </w:rPr>
           </w:pPr>
-          <w:hyperlink w:anchor="_Toc241691996" w:history="1">
+          <w:hyperlink w:anchor="_Toc241692608" w:history="1">
             <w:r>
               <w:rPr>
                 <w:rStyle w:val="Hiperligao"/>
@@ -1116,7 +1116,7 @@
               <w:rPr>
                 <w:noProof/>
               </w:rPr>
-              <w:instrText xml:space="preserve"> PAGEREF _Toc241691996 \h </w:instrText>
+              <w:instrText xml:space="preserve"> PAGEREF _Toc241692608 \h </w:instrText>
             </w:r>
             <w:r>
               <w:rPr>
@@ -1158,7 +1158,7 @@
               <w14:ligatures w14:val="standardContextual"/>
             </w:rPr>
           </w:pPr>
-          <w:hyperlink w:anchor="_Toc241691997" w:history="1">
+          <w:hyperlink w:anchor="_Toc241692609" w:history="1">
             <w:r>
               <w:rPr>
                 <w:rStyle w:val="Hiperligao"/>
@@ -1182,7 +1182,7 @@
               <w:rPr>
                 <w:noProof/>
               </w:rPr>
-              <w:instrText xml:space="preserve"> PAGEREF _Toc241691997 \h </w:instrText>
+              <w:instrText xml:space="preserve"> PAGEREF _Toc241692609 \h </w:instrText>
             </w:r>
             <w:r>
               <w:rPr>
@@ -1224,7 +1224,7 @@
               <w14:ligatures w14:val="standardContextual"/>
             </w:rPr>
           </w:pPr>
-          <w:hyperlink w:anchor="_Toc241691998" w:history="1">
+          <w:hyperlink w:anchor="_Toc241692610" w:history="1">
             <w:r>
               <w:rPr>
                 <w:rStyle w:val="Hiperligao"/>
@@ -1248,7 +1248,7 @@
               <w:rPr>
                 <w:noProof/>
               </w:rPr>
-              <w:instrText xml:space="preserve"> PAGEREF _Toc241691998 \h </w:instrText>
+              <w:instrText xml:space="preserve"> PAGEREF _Toc241692610 \h </w:instrText>
             </w:r>
             <w:r>
               <w:rPr>
@@ -1290,7 +1290,7 @@
               <w14:ligatures w14:val="standardContextual"/>
             </w:rPr>
           </w:pPr>
-          <w:hyperlink w:anchor="_Toc241691999" w:history="1">
+          <w:hyperlink w:anchor="_Toc241692611" w:history="1">
             <w:r>
               <w:rPr>
                 <w:rStyle w:val="Hiperligao"/>
@@ -1314,7 +1314,7 @@
               <w:rPr>
                 <w:noProof/>
               </w:rPr>
-              <w:instrText xml:space="preserve"> PAGEREF _Toc241691999 \h </w:instrText>
+              <w:instrText xml:space="preserve"> PAGEREF _Toc241692611 \h </w:instrText>
             </w:r>
             <w:r>
               <w:rPr>
@@ -1356,7 +1356,7 @@
               <w14:ligatures w14:val="standardContextual"/>
             </w:rPr>
           </w:pPr>
-          <w:hyperlink w:anchor="_Toc241692000" w:history="1">
+          <w:hyperlink w:anchor="_Toc241692612" w:history="1">
             <w:r>
               <w:rPr>
                 <w:rStyle w:val="Hiperligao"/>
@@ -1380,7 +1380,7 @@
               <w:rPr>
                 <w:noProof/>
               </w:rPr>
-              <w:instrText xml:space="preserve"> PAGEREF _Toc241692000 \h </w:instrText>
+              <w:instrText xml:space="preserve"> PAGEREF _Toc241692612 \h </w:instrText>
             </w:r>
             <w:r>
               <w:rPr>
@@ -1422,7 +1422,7 @@
               <w14:ligatures w14:val="standardContextual"/>
             </w:rPr>
           </w:pPr>
-          <w:hyperlink w:anchor="_Toc241692001" w:history="1">
+          <w:hyperlink w:anchor="_Toc241692613" w:history="1">
             <w:r>
               <w:rPr>
                 <w:rStyle w:val="Hiperligao"/>
@@ -1446,7 +1446,7 @@
               <w:rPr>
                 <w:noProof/>
               </w:rPr>
-              <w:instrText xml:space="preserve"> PAGEREF _Toc241692001 \h </w:instrText>
+              <w:instrText xml:space="preserve"> PAGEREF _Toc241692613 \h </w:instrText>
             </w:r>
             <w:r>
               <w:rPr>
@@ -1488,7 +1488,7 @@
               <w14:ligatures w14:val="standardContextual"/>
             </w:rPr>
           </w:pPr>
-          <w:hyperlink w:anchor="_Toc241692002" w:history="1">
+          <w:hyperlink w:anchor="_Toc241692614" w:history="1">
             <w:r>
               <w:rPr>
                 <w:rStyle w:val="Hiperligao"/>
@@ -1512,7 +1512,7 @@
               <w:rPr>
                 <w:noProof/>
               </w:rPr>
-              <w:instrText xml:space="preserve"> PAGEREF _Toc241692002 \h </w:instrText>
+              <w:instrText xml:space="preserve"> PAGEREF _Toc241692614 \h </w:instrText>
             </w:r>
             <w:r>
               <w:rPr>
@@ -1554,7 +1554,7 @@
               <w14:ligatures w14:val="standardContextual"/>
             </w:rPr>
           </w:pPr>
-          <w:hyperlink w:anchor="_Toc241692003" w:history="1">
+          <w:hyperlink w:anchor="_Toc241692615" w:history="1">
             <w:r>
               <w:rPr>
                 <w:rStyle w:val="Hiperligao"/>
@@ -1578,7 +1578,7 @@
               <w:rPr>
                 <w:noProof/>
               </w:rPr>
-              <w:instrText xml:space="preserve"> PAGEREF _Toc241692003 \h </w:instrText>
+              <w:instrText xml:space="preserve"> PAGEREF _Toc241692615 \h </w:instrText>
             </w:r>
             <w:r>
               <w:rPr>
@@ -1620,7 +1620,7 @@
               <w14:ligatures w14:val="standardContextual"/>
             </w:rPr>
           </w:pPr>
-          <w:hyperlink w:anchor="_Toc241692004" w:history="1">
+          <w:hyperlink w:anchor="_Toc241692616" w:history="1">
             <w:r>
               <w:rPr>
                 <w:rStyle w:val="Hiperligao"/>
@@ -1644,7 +1644,7 @@
               <w:rPr>
                 <w:noProof/>
               </w:rPr>
-              <w:instrText xml:space="preserve"> PAGEREF _Toc241692004 \h </w:instrText>
+              <w:instrText xml:space="preserve"> PAGEREF _Toc241692616 \h </w:instrText>
             </w:r>
             <w:r>
               <w:rPr>
@@ -1686,7 +1686,7 @@
               <w14:ligatures w14:val="standardContextual"/>
             </w:rPr>
           </w:pPr>
-          <w:hyperlink w:anchor="_Toc241692005" w:history="1">
+          <w:hyperlink w:anchor="_Toc241692617" w:history="1">
             <w:r>
               <w:rPr>
                 <w:rStyle w:val="Hiperligao"/>
@@ -1710,7 +1710,7 @@
               <w:rPr>
                 <w:noProof/>
               </w:rPr>
-              <w:instrText xml:space="preserve"> PAGEREF _Toc241692005 \h </w:instrText>
+              <w:instrText xml:space="preserve"> PAGEREF _Toc241692617 \h </w:instrText>
             </w:r>
             <w:r>
               <w:rPr>
@@ -1752,7 +1752,7 @@
               <w14:ligatures w14:val="standardContextual"/>
             </w:rPr>
           </w:pPr>
-          <w:hyperlink w:anchor="_Toc241692006" w:history="1">
+          <w:hyperlink w:anchor="_Toc241692618" w:history="1">
             <w:r>
               <w:rPr>
                 <w:rStyle w:val="Hiperligao"/>
@@ -1776,7 +1776,7 @@
               <w:rPr>
                 <w:noProof/>
               </w:rPr>
-              <w:instrText xml:space="preserve"> PAGEREF _Toc241692006 \h </w:instrText>
+              <w:instrText xml:space="preserve"> PAGEREF _Toc241692618 \h </w:instrText>
             </w:r>
             <w:r>
               <w:rPr>
@@ -1818,7 +1818,7 @@
               <w14:ligatures w14:val="standardContextual"/>
             </w:rPr>
           </w:pPr>
-          <w:hyperlink w:anchor="_Toc241692007" w:history="1">
+          <w:hyperlink w:anchor="_Toc241692619" w:history="1">
             <w:r>
               <w:rPr>
                 <w:rStyle w:val="Hiperligao"/>
@@ -1842,7 +1842,7 @@
               <w:rPr>
                 <w:noProof/>
               </w:rPr>
-              <w:instrText xml:space="preserve"> PAGEREF _Toc241692007 \h </w:instrText>
+              <w:instrText xml:space="preserve"> PAGEREF _Toc241692619 \h </w:instrText>
             </w:r>
             <w:r>
               <w:rPr>
@@ -1884,7 +1884,7 @@
               <w14:ligatures w14:val="standardContextual"/>
             </w:rPr>
           </w:pPr>
-          <w:hyperlink w:anchor="_Toc241692008" w:history="1">
+          <w:hyperlink w:anchor="_Toc241692620" w:history="1">
             <w:r>
               <w:rPr>
                 <w:rStyle w:val="Hiperligao"/>
@@ -1908,7 +1908,7 @@
               <w:rPr>
                 <w:noProof/>
               </w:rPr>
-              <w:instrText xml:space="preserve"> PAGEREF _Toc241692008 \h </w:instrText>
+              <w:instrText xml:space="preserve"> PAGEREF _Toc241692620 \h </w:instrText>
             </w:r>
             <w:r>
               <w:rPr>
@@ -1950,7 +1950,7 @@
               <w14:ligatures w14:val="standardContextual"/>
             </w:rPr>
           </w:pPr>
-          <w:hyperlink w:anchor="_Toc241692009" w:history="1">
+          <w:hyperlink w:anchor="_Toc241692621" w:history="1">
             <w:r>
               <w:rPr>
                 <w:rStyle w:val="Hiperligao"/>
@@ -1974,7 +1974,7 @@
               <w:rPr>
                 <w:noProof/>
               </w:rPr>
-              <w:instrText xml:space="preserve"> PAGEREF _Toc241692009 \h </w:instrText>
+              <w:instrText xml:space="preserve"> PAGEREF _Toc241692621 \h </w:instrText>
             </w:r>
             <w:r>
               <w:rPr>
@@ -2016,7 +2016,7 @@
               <w14:ligatures w14:val="standardContextual"/>
             </w:rPr>
           </w:pPr>
-          <w:hyperlink w:anchor="_Toc241692010" w:history="1">
+          <w:hyperlink w:anchor="_Toc241692622" w:history="1">
             <w:r>
               <w:rPr>
                 <w:rStyle w:val="Hiperligao"/>
@@ -2040,7 +2040,7 @@
               <w:rPr>
                 <w:noProof/>
               </w:rPr>
-              <w:instrText xml:space="preserve"> PAGEREF _Toc241692010 \h </w:instrText>
+              <w:instrText xml:space="preserve"> PAGEREF _Toc241692622 \h </w:instrText>
             </w:r>
             <w:r>
               <w:rPr>
@@ -2082,7 +2082,7 @@
               <w14:ligatures w14:val="standardContextual"/>
             </w:rPr>
           </w:pPr>
-          <w:hyperlink w:anchor="_Toc241692011" w:history="1">
+          <w:hyperlink w:anchor="_Toc241692623" w:history="1">
             <w:r>
               <w:rPr>
                 <w:rStyle w:val="Hiperligao"/>
@@ -2106,7 +2106,7 @@
               <w:rPr>
                 <w:noProof/>
               </w:rPr>
-              <w:instrText xml:space="preserve"> PAGEREF _Toc241692011 \h </w:instrText>
+              <w:instrText xml:space="preserve"> PAGEREF _Toc241692623 \h </w:instrText>
             </w:r>
             <w:r>
               <w:rPr>
@@ -2148,7 +2148,7 @@
               <w14:ligatures w14:val="standardContextual"/>
             </w:rPr>
           </w:pPr>
-          <w:hyperlink w:anchor="_Toc241692012" w:history="1">
+          <w:hyperlink w:anchor="_Toc241692624" w:history="1">
             <w:r>
               <w:rPr>
                 <w:rStyle w:val="Hiperligao"/>
@@ -2172,7 +2172,7 @@
               <w:rPr>
                 <w:noProof/>
               </w:rPr>
-              <w:instrText xml:space="preserve"> PAGEREF _Toc241692012 \h </w:instrText>
+              <w:instrText xml:space="preserve"> PAGEREF _Toc241692624 \h </w:instrText>
             </w:r>
             <w:r>
               <w:rPr>
@@ -2214,7 +2214,7 @@
               <w14:ligatures w14:val="standardContextual"/>
             </w:rPr>
           </w:pPr>
-          <w:hyperlink w:anchor="_Toc241692013" w:history="1">
+          <w:hyperlink w:anchor="_Toc241692625" w:history="1">
             <w:r>
               <w:rPr>
                 <w:rStyle w:val="Hiperligao"/>
@@ -2238,7 +2238,7 @@
               <w:rPr>
                 <w:noProof/>
               </w:rPr>
-              <w:instrText xml:space="preserve"> PAGEREF _Toc241692013 \h </w:instrText>
+              <w:instrText xml:space="preserve"> PAGEREF _Toc241692625 \h </w:instrText>
             </w:r>
             <w:r>
               <w:rPr>
@@ -2280,7 +2280,7 @@
               <w14:ligatures w14:val="standardContextual"/>
             </w:rPr>
           </w:pPr>
-          <w:hyperlink w:anchor="_Toc241692014" w:history="1">
+          <w:hyperlink w:anchor="_Toc241692626" w:history="1">
             <w:r>
               <w:rPr>
                 <w:rStyle w:val="Hiperligao"/>
@@ -2304,7 +2304,7 @@
               <w:rPr>
                 <w:noProof/>
               </w:rPr>
-              <w:instrText xml:space="preserve"> PAGEREF _Toc241692014 \h </w:instrText>
+              <w:instrText xml:space="preserve"> PAGEREF _Toc241692626 \h </w:instrText>
             </w:r>
             <w:r>
               <w:rPr>
@@ -2352,7 +2352,7 @@
       <w:pPr>
         <w:pStyle w:val="Ttulo1"/>
       </w:pPr>
-      <w:bookmarkStart w:id="0" w:name="_Toc241691981"/>
+      <w:bookmarkStart w:id="0" w:name="_Toc241692593"/>
       <w:r>
         <w:lastRenderedPageBreak/>
         <w:t>Your role at a glance</w:t>
@@ -2433,7 +2433,7 @@
       <w:pPr>
         <w:pStyle w:val="Ttulo2"/>
       </w:pPr>
-      <w:bookmarkStart w:id="1" w:name="_Toc241691982"/>
+      <w:bookmarkStart w:id="1" w:name="_Toc241692594"/>
       <w:r>
         <w:t>You can / You cannot</w:t>
       </w:r>
@@ -3208,7 +3208,7 @@
       <w:pPr>
         <w:pStyle w:val="Ttulo2"/>
       </w:pPr>
-      <w:bookmarkStart w:id="2" w:name="_Toc241691983"/>
+      <w:bookmarkStart w:id="2" w:name="_Toc241692595"/>
       <w:r>
         <w:t>Where your access comes from</w:t>
       </w:r>
@@ -3818,7 +3818,7 @@
       <w:pPr>
         <w:pStyle w:val="Ttulo2"/>
       </w:pPr>
-      <w:bookmarkStart w:id="3" w:name="_Toc241691984"/>
+      <w:bookmarkStart w:id="3" w:name="_Toc241692596"/>
       <w:r>
         <w:t>How to sign in, change your password, and sign out</w:t>
       </w:r>
@@ -3943,10 +3943,10 @@
         </w:rPr>
         <w:lastRenderedPageBreak/>
         <w:drawing>
-          <wp:inline distT="0" distB="0" distL="0" distR="0" wp14:anchorId="41F5B591" wp14:editId="0A435572">
+          <wp:inline distT="0" distB="0" distL="0" distR="0" wp14:anchorId="03EE6FD0" wp14:editId="6D443CE7">
             <wp:extent cx="5715000" cy="3571875"/>
             <wp:effectExtent l="0" t="0" r="0" b="0"/>
-            <wp:docPr id="197" name="01-login.png" descr="The sign-in page with Email, Password, Remember me and the Sign in button." title="The sign-in page with Email, Password, Remember me and the Sign in button."/>
+            <wp:docPr id="1" name="01-login.png" descr="The sign-in page with Email, Password, Remember me and the Sign in button." title="The sign-in page with Email, Password, Remember me and the Sign in button."/>
             <wp:cNvGraphicFramePr>
               <a:graphicFrameLocks xmlns:a="http://schemas.openxmlformats.org/drawingml/2006/main" noChangeAspect="1"/>
             </wp:cNvGraphicFramePr>
@@ -4054,10 +4054,10 @@
         </w:rPr>
         <w:lastRenderedPageBreak/>
         <w:drawing>
-          <wp:inline distT="0" distB="0" distL="0" distR="0" wp14:anchorId="54319AC1" wp14:editId="0E0ABBA1">
+          <wp:inline distT="0" distB="0" distL="0" distR="0" wp14:anchorId="6DE1488D" wp14:editId="76A932F2">
             <wp:extent cx="5715000" cy="3571875"/>
             <wp:effectExtent l="0" t="0" r="0" b="0"/>
-            <wp:docPr id="198" name="03-user-menu.png" descr="The account menu open, with Settings and Log out." title="The account menu open, with Settings and Log out."/>
+            <wp:docPr id="2" name="03-user-menu.png" descr="The account menu open, with Settings and Log out." title="The account menu open, with Settings and Log out."/>
             <wp:cNvGraphicFramePr>
               <a:graphicFrameLocks xmlns:a="http://schemas.openxmlformats.org/drawingml/2006/main" noChangeAspect="1"/>
             </wp:cNvGraphicFramePr>
@@ -4107,7 +4107,7 @@
         <w:pStyle w:val="Ttulo1"/>
         <w:pageBreakBefore/>
       </w:pPr>
-      <w:bookmarkStart w:id="4" w:name="_Toc241691985"/>
+      <w:bookmarkStart w:id="4" w:name="_Toc241692597"/>
       <w:r>
         <w:lastRenderedPageBreak/>
         <w:t>Dashboard</w:t>
@@ -4140,10 +4140,10 @@
           <w:noProof/>
         </w:rPr>
         <w:drawing>
-          <wp:inline distT="0" distB="0" distL="0" distR="0" wp14:anchorId="4CCCB6FA" wp14:editId="64946418">
+          <wp:inline distT="0" distB="0" distL="0" distR="0" wp14:anchorId="54145324" wp14:editId="2AC67534">
             <wp:extent cx="5715000" cy="5133975"/>
             <wp:effectExtent l="0" t="0" r="0" b="0"/>
-            <wp:docPr id="199" name="01-dashboard-sidebar.png" descr="The Manager dashboard with the sidebar and summary cards." title="The Manager dashboard with the sidebar and summary cards."/>
+            <wp:docPr id="3" name="01-dashboard-sidebar.png" descr="The Manager dashboard with the sidebar and summary cards." title="The Manager dashboard with the sidebar and summary cards."/>
             <wp:cNvGraphicFramePr>
               <a:graphicFrameLocks xmlns:a="http://schemas.openxmlformats.org/drawingml/2006/main" noChangeAspect="1"/>
             </wp:cNvGraphicFramePr>
@@ -4648,7 +4648,7 @@
         <w:pStyle w:val="Ttulo1"/>
         <w:pageBreakBefore/>
       </w:pPr>
-      <w:bookmarkStart w:id="5" w:name="_Toc241691986"/>
+      <w:bookmarkStart w:id="5" w:name="_Toc241692598"/>
       <w:r>
         <w:lastRenderedPageBreak/>
         <w:t>Custom Functions</w:t>
@@ -4671,10 +4671,10 @@
           <w:noProof/>
         </w:rPr>
         <w:drawing>
-          <wp:inline distT="0" distB="0" distL="0" distR="0" wp14:anchorId="2BD0CD4E" wp14:editId="0460E1FC">
+          <wp:inline distT="0" distB="0" distL="0" distR="0" wp14:anchorId="1A8B1FAA" wp14:editId="664A7314">
             <wp:extent cx="5715000" cy="3571875"/>
             <wp:effectExtent l="0" t="0" r="0" b="0"/>
-            <wp:docPr id="200" name="08-custom-functions.png" descr="The Custom Functions page with the list, Refresh all and New Function." title="The Custom Functions page with the list, Refresh all and New Function."/>
+            <wp:docPr id="4" name="08-custom-functions.png" descr="The Custom Functions page with the list, Refresh all and New Function." title="The Custom Functions page with the list, Refresh all and New Function."/>
             <wp:cNvGraphicFramePr>
               <a:graphicFrameLocks xmlns:a="http://schemas.openxmlformats.org/drawingml/2006/main" noChangeAspect="1"/>
             </wp:cNvGraphicFramePr>
@@ -6213,7 +6213,7 @@
       <w:pPr>
         <w:pStyle w:val="Ttulo2"/>
       </w:pPr>
-      <w:bookmarkStart w:id="6" w:name="_Toc241691987"/>
+      <w:bookmarkStart w:id="6" w:name="_Toc241692599"/>
       <w:r>
         <w:t>Example: register a package function</w:t>
       </w:r>
@@ -6359,7 +6359,7 @@
         <w:pStyle w:val="Ttulo1"/>
         <w:pageBreakBefore/>
       </w:pPr>
-      <w:bookmarkStart w:id="7" w:name="_Toc241691988"/>
+      <w:bookmarkStart w:id="7" w:name="_Toc241692600"/>
       <w:r>
         <w:lastRenderedPageBreak/>
         <w:t>Data Sources</w:t>
@@ -6382,10 +6382,10 @@
           <w:noProof/>
         </w:rPr>
         <w:drawing>
-          <wp:inline distT="0" distB="0" distL="0" distR="0" wp14:anchorId="13CA4050" wp14:editId="511206A4">
+          <wp:inline distT="0" distB="0" distL="0" distR="0" wp14:anchorId="512DBA8E" wp14:editId="625AAFD4">
             <wp:extent cx="5715000" cy="3571875"/>
             <wp:effectExtent l="0" t="0" r="0" b="0"/>
-            <wp:docPr id="201" name="07-data-sources.png" descr="The Data Sources page with the list of connections and row icons." title="The Data Sources page with the list of connections and row icons."/>
+            <wp:docPr id="5" name="07-data-sources.png" descr="The Data Sources page with the list of connections and row icons." title="The Data Sources page with the list of connections and row icons."/>
             <wp:cNvGraphicFramePr>
               <a:graphicFrameLocks xmlns:a="http://schemas.openxmlformats.org/drawingml/2006/main" noChangeAspect="1"/>
             </wp:cNvGraphicFramePr>
@@ -7057,7 +7057,7 @@
         <w:pStyle w:val="Ttulo1"/>
         <w:pageBreakBefore/>
       </w:pPr>
-      <w:bookmarkStart w:id="8" w:name="_Toc241691989"/>
+      <w:bookmarkStart w:id="8" w:name="_Toc241692601"/>
       <w:r>
         <w:lastRenderedPageBreak/>
         <w:t>Users</w:t>
@@ -7090,10 +7090,10 @@
           <w:noProof/>
         </w:rPr>
         <w:drawing>
-          <wp:inline distT="0" distB="0" distL="0" distR="0" wp14:anchorId="3B95A9A7" wp14:editId="779A50F8">
+          <wp:inline distT="0" distB="0" distL="0" distR="0" wp14:anchorId="4C18347A" wp14:editId="57A20BB4">
             <wp:extent cx="5715000" cy="3571875"/>
             <wp:effectExtent l="0" t="0" r="0" b="0"/>
-            <wp:docPr id="202" name="06-users.png" descr="The read-only Users list, without New User or Credentials file buttons." title="The read-only Users list, without New User or Credentials file buttons."/>
+            <wp:docPr id="6" name="06-users.png" descr="The read-only Users list, without New User or Credentials file buttons." title="The read-only Users list, without New User or Credentials file buttons."/>
             <wp:cNvGraphicFramePr>
               <a:graphicFrameLocks xmlns:a="http://schemas.openxmlformats.org/drawingml/2006/main" noChangeAspect="1"/>
             </wp:cNvGraphicFramePr>
@@ -7207,7 +7207,7 @@
       <w:pPr>
         <w:pStyle w:val="Ttulo2"/>
       </w:pPr>
-      <w:bookmarkStart w:id="9" w:name="_Toc241691990"/>
+      <w:bookmarkStart w:id="9" w:name="_Toc241692602"/>
       <w:r>
         <w:t>Maps for a person</w:t>
       </w:r>
@@ -7249,10 +7249,10 @@
           <w:noProof/>
         </w:rPr>
         <w:drawing>
-          <wp:inline distT="0" distB="0" distL="0" distR="0" wp14:anchorId="76212A1C" wp14:editId="7159634A">
-            <wp:extent cx="4362450" cy="2190750"/>
+          <wp:inline distT="0" distB="0" distL="0" distR="0" wp14:anchorId="7EA7DAFE" wp14:editId="088943FA">
+            <wp:extent cx="4362450" cy="1819275"/>
             <wp:effectExtent l="0" t="0" r="0" b="0"/>
-            <wp:docPr id="203" name="11-users-maps-dialog.png" descr="The Maps dialog for a user, with share-level selects and owner and remove icons." title="The Maps dialog for a user, with share-level selects and owner and remove icons."/>
+            <wp:docPr id="7" name="11-users-maps-dialog.png" descr="The Maps dialog for a user, with share-level selects and owner and remove icons." title="The Maps dialog for a user, with share-level selects and owner and remove icons."/>
             <wp:cNvGraphicFramePr>
               <a:graphicFrameLocks xmlns:a="http://schemas.openxmlformats.org/drawingml/2006/main" noChangeAspect="1"/>
             </wp:cNvGraphicFramePr>
@@ -7275,7 +7275,7 @@
                   <pic:spPr bwMode="auto">
                     <a:xfrm>
                       <a:off x="0" y="0"/>
-                      <a:ext cx="4362450" cy="2190750"/>
+                      <a:ext cx="4362450" cy="1819275"/>
                     </a:xfrm>
                     <a:prstGeom prst="rect">
                       <a:avLst/>
@@ -7356,7 +7356,6 @@
                 <w:bCs/>
                 <w:color w:val="FFFFFF"/>
               </w:rPr>
-              <w:lastRenderedPageBreak/>
               <w:t>Button or control</w:t>
             </w:r>
           </w:p>
@@ -7490,6 +7489,7 @@
                 <w:b/>
                 <w:bCs/>
               </w:rPr>
+              <w:lastRenderedPageBreak/>
               <w:t>Owner: {name}</w:t>
             </w:r>
           </w:p>
@@ -8550,7 +8550,7 @@
       <w:pPr>
         <w:pStyle w:val="Ttulo2"/>
       </w:pPr>
-      <w:bookmarkStart w:id="10" w:name="_Toc241691991"/>
+      <w:bookmarkStart w:id="10" w:name="_Toc241692603"/>
       <w:r>
         <w:t>Example: give a map to a colleague who takes over</w:t>
       </w:r>
@@ -8678,7 +8678,7 @@
         <w:pStyle w:val="Ttulo1"/>
         <w:pageBreakBefore/>
       </w:pPr>
-      <w:bookmarkStart w:id="11" w:name="_Toc241691992"/>
+      <w:bookmarkStart w:id="11" w:name="_Toc241692604"/>
       <w:r>
         <w:lastRenderedPageBreak/>
         <w:t>Maps</w:t>
@@ -8711,10 +8711,10 @@
           <w:noProof/>
         </w:rPr>
         <w:drawing>
-          <wp:inline distT="0" distB="0" distL="0" distR="0" wp14:anchorId="0D42F61D" wp14:editId="5CE85D1F">
+          <wp:inline distT="0" distB="0" distL="0" distR="0" wp14:anchorId="1501917C" wp14:editId="7836F658">
             <wp:extent cx="5715000" cy="3429000"/>
             <wp:effectExtent l="0" t="0" r="0" b="0"/>
-            <wp:docPr id="204" name="02-maps-all.png" descr="The Maps list, All tab, with Copy, Share, Schedule and Export icons on each row." title="The Maps list, All tab, with Copy, Share, Schedule and Export icons on each row."/>
+            <wp:docPr id="8" name="02-maps-all.png" descr="The Maps list, All tab, with Copy, Share, Schedule and Export icons on each row." title="The Maps list, All tab, with Copy, Share, Schedule and Export icons on each row."/>
             <wp:cNvGraphicFramePr>
               <a:graphicFrameLocks xmlns:a="http://schemas.openxmlformats.org/drawingml/2006/main" noChangeAspect="1"/>
             </wp:cNvGraphicFramePr>
@@ -8763,7 +8763,7 @@
       <w:pPr>
         <w:pStyle w:val="Ttulo2"/>
       </w:pPr>
-      <w:bookmarkStart w:id="12" w:name="_Toc241691993"/>
+      <w:bookmarkStart w:id="12" w:name="_Toc241692605"/>
       <w:r>
         <w:t>Finding a map</w:t>
       </w:r>
@@ -9389,7 +9389,7 @@
       <w:pPr>
         <w:pStyle w:val="Ttulo2"/>
       </w:pPr>
-      <w:bookmarkStart w:id="13" w:name="_Toc241691994"/>
+      <w:bookmarkStart w:id="13" w:name="_Toc241692606"/>
       <w:r>
         <w:lastRenderedPageBreak/>
         <w:t>What each icon does</w:t>
@@ -9989,7 +9989,7 @@
       <w:pPr>
         <w:pStyle w:val="Ttulo2"/>
       </w:pPr>
-      <w:bookmarkStart w:id="14" w:name="_Toc241691995"/>
+      <w:bookmarkStart w:id="14" w:name="_Toc241692607"/>
       <w:r>
         <w:t>Copy a map to build your own</w:t>
       </w:r>
@@ -10078,7 +10078,7 @@
       <w:pPr>
         <w:pStyle w:val="Ttulo2"/>
       </w:pPr>
-      <w:bookmarkStart w:id="15" w:name="_Toc241691996"/>
+      <w:bookmarkStart w:id="15" w:name="_Toc241692608"/>
       <w:r>
         <w:t>Share a map</w:t>
       </w:r>
@@ -10183,10 +10183,10 @@
         </w:rPr>
         <w:lastRenderedPageBreak/>
         <w:drawing>
-          <wp:inline distT="0" distB="0" distL="0" distR="0" wp14:anchorId="59495D01" wp14:editId="6E81DB08">
+          <wp:inline distT="0" distB="0" distL="0" distR="0" wp14:anchorId="6F9585ED" wp14:editId="563FCDF5">
             <wp:extent cx="3743325" cy="3895725"/>
             <wp:effectExtent l="0" t="0" r="0" b="0"/>
-            <wp:docPr id="205" name="03-share-dialog.png" descr="The Share map dialog with a search box and Can view, Can export and Can edit buttons." title="The Share map dialog with a search box and Can view, Can export and Can edit buttons."/>
+            <wp:docPr id="9" name="03-share-dialog.png" descr="The Share map dialog with a search box and Can view, Can export and Can edit buttons." title="The Share map dialog with a search box and Can view, Can export and Can edit buttons."/>
             <wp:cNvGraphicFramePr>
               <a:graphicFrameLocks xmlns:a="http://schemas.openxmlformats.org/drawingml/2006/main" noChangeAspect="1"/>
             </wp:cNvGraphicFramePr>
@@ -10266,7 +10266,7 @@
         <w:pStyle w:val="Ttulo1"/>
         <w:pageBreakBefore/>
       </w:pPr>
-      <w:bookmarkStart w:id="16" w:name="_Toc241691997"/>
+      <w:bookmarkStart w:id="16" w:name="_Toc241692609"/>
       <w:r>
         <w:lastRenderedPageBreak/>
         <w:t>Map builder</w:t>
@@ -10299,10 +10299,10 @@
           <w:noProof/>
         </w:rPr>
         <w:drawing>
-          <wp:inline distT="0" distB="0" distL="0" distR="0" wp14:anchorId="06BCC2C9" wp14:editId="12895CAF">
+          <wp:inline distT="0" distB="0" distL="0" distR="0" wp14:anchorId="68CD0964" wp14:editId="1CEE35EB">
             <wp:extent cx="5715000" cy="3571875"/>
             <wp:effectExtent l="0" t="0" r="0" b="0"/>
-            <wp:docPr id="206" name="05-builder-overview.png" descr="The map builder with the Business Areas tree, the columns canvas and the Properties panel." title="The map builder with the Business Areas tree, the columns canvas and the Properties panel."/>
+            <wp:docPr id="10" name="05-builder-overview.png" descr="The map builder with the Business Areas tree, the columns canvas and the Properties panel." title="The map builder with the Business Areas tree, the columns canvas and the Properties panel."/>
             <wp:cNvGraphicFramePr>
               <a:graphicFrameLocks xmlns:a="http://schemas.openxmlformats.org/drawingml/2006/main" noChangeAspect="1"/>
             </wp:cNvGraphicFramePr>
@@ -10351,7 +10351,7 @@
       <w:pPr>
         <w:pStyle w:val="Ttulo2"/>
       </w:pPr>
-      <w:bookmarkStart w:id="17" w:name="_Toc241691998"/>
+      <w:bookmarkStart w:id="17" w:name="_Toc241692610"/>
       <w:r>
         <w:t>What you may save</w:t>
       </w:r>
@@ -10732,7 +10732,7 @@
       <w:pPr>
         <w:pStyle w:val="Ttulo2"/>
       </w:pPr>
-      <w:bookmarkStart w:id="18" w:name="_Toc241691999"/>
+      <w:bookmarkStart w:id="18" w:name="_Toc241692611"/>
       <w:r>
         <w:t>The toolbar</w:t>
       </w:r>
@@ -11573,7 +11573,7 @@
       <w:pPr>
         <w:pStyle w:val="Ttulo2"/>
       </w:pPr>
-      <w:bookmarkStart w:id="19" w:name="_Toc241692000"/>
+      <w:bookmarkStart w:id="19" w:name="_Toc241692612"/>
       <w:r>
         <w:t>Build a map</w:t>
       </w:r>
@@ -11741,7 +11741,7 @@
       <w:pPr>
         <w:pStyle w:val="Ttulo2"/>
       </w:pPr>
-      <w:bookmarkStart w:id="20" w:name="_Toc241692001"/>
+      <w:bookmarkStart w:id="20" w:name="_Toc241692613"/>
       <w:r>
         <w:t>Configure column</w:t>
       </w:r>
@@ -13658,7 +13658,7 @@
       <w:pPr>
         <w:pStyle w:val="Ttulo2"/>
       </w:pPr>
-      <w:bookmarkStart w:id="21" w:name="_Toc241692002"/>
+      <w:bookmarkStart w:id="21" w:name="_Toc241692614"/>
       <w:r>
         <w:t>The five settings tabs</w:t>
       </w:r>
@@ -15323,7 +15323,7 @@
       <w:pPr>
         <w:pStyle w:val="Ttulo2"/>
       </w:pPr>
-      <w:bookmarkStart w:id="22" w:name="_Toc241692003"/>
+      <w:bookmarkStart w:id="22" w:name="_Toc241692615"/>
       <w:r>
         <w:lastRenderedPageBreak/>
         <w:t>Conditional formatting</w:t>
@@ -16030,7 +16030,7 @@
       <w:pPr>
         <w:pStyle w:val="Ttulo2"/>
       </w:pPr>
-      <w:bookmarkStart w:id="23" w:name="_Toc241692004"/>
+      <w:bookmarkStart w:id="23" w:name="_Toc241692616"/>
       <w:r>
         <w:t>Refused maps</w:t>
       </w:r>
@@ -16046,7 +16046,7 @@
         <w:pStyle w:val="Ttulo1"/>
         <w:pageBreakBefore/>
       </w:pPr>
-      <w:bookmarkStart w:id="24" w:name="_Toc241692005"/>
+      <w:bookmarkStart w:id="24" w:name="_Toc241692617"/>
       <w:r>
         <w:lastRenderedPageBreak/>
         <w:t>Map viewer</w:t>
@@ -16089,10 +16089,10 @@
           <w:noProof/>
         </w:rPr>
         <w:drawing>
-          <wp:inline distT="0" distB="0" distL="0" distR="0" wp14:anchorId="3AB559E0" wp14:editId="5A45B7F8">
+          <wp:inline distT="0" distB="0" distL="0" distR="0" wp14:anchorId="7997441F" wp14:editId="3B1D4B9A">
             <wp:extent cx="5715000" cy="3571875"/>
             <wp:effectExtent l="0" t="0" r="0" b="0"/>
-            <wp:docPr id="207" name="06-viewer-results.png" descr="A completed run with Excel, CSV and PDF buttons over the results grid." title="A completed run with Excel, CSV and PDF buttons over the results grid."/>
+            <wp:docPr id="11" name="06-viewer-results.png" descr="A completed run with Excel, CSV and PDF buttons over the results grid." title="A completed run with Excel, CSV and PDF buttons over the results grid."/>
             <wp:cNvGraphicFramePr>
               <a:graphicFrameLocks xmlns:a="http://schemas.openxmlformats.org/drawingml/2006/main" noChangeAspect="1"/>
             </wp:cNvGraphicFramePr>
@@ -16978,7 +16978,7 @@
       <w:pPr>
         <w:pStyle w:val="Ttulo2"/>
       </w:pPr>
-      <w:bookmarkStart w:id="25" w:name="_Toc241692006"/>
+      <w:bookmarkStart w:id="25" w:name="_Toc241692618"/>
       <w:r>
         <w:t>Export to PDF</w:t>
       </w:r>
@@ -17390,7 +17390,7 @@
       <w:pPr>
         <w:pStyle w:val="Ttulo2"/>
       </w:pPr>
-      <w:bookmarkStart w:id="26" w:name="_Toc241692007"/>
+      <w:bookmarkStart w:id="26" w:name="_Toc241692619"/>
       <w:r>
         <w:t>Example: run and export GD_M.M10_V01.DIS</w:t>
       </w:r>
@@ -17503,7 +17503,7 @@
         <w:pStyle w:val="Ttulo1"/>
         <w:pageBreakBefore/>
       </w:pPr>
-      <w:bookmarkStart w:id="27" w:name="_Toc241692008"/>
+      <w:bookmarkStart w:id="27" w:name="_Toc241692620"/>
       <w:r>
         <w:lastRenderedPageBreak/>
         <w:t>Schedules</w:t>
@@ -17526,10 +17526,10 @@
           <w:noProof/>
         </w:rPr>
         <w:drawing>
-          <wp:inline distT="0" distB="0" distL="0" distR="0" wp14:anchorId="3FAF9DE1" wp14:editId="4F489315">
+          <wp:inline distT="0" distB="0" distL="0" distR="0" wp14:anchorId="6DEA33FA" wp14:editId="4CD8E047">
             <wp:extent cx="5715000" cy="3571875"/>
             <wp:effectExtent l="0" t="0" r="0" b="0"/>
-            <wp:docPr id="208" name="38-schedules-list.png" descr="The Schedules page with a paused schedule and its action icons." title="The Schedules page with a paused schedule and its action icons."/>
+            <wp:docPr id="12" name="38-schedules-list.png" descr="The Schedules page with a paused schedule and its action icons." title="The Schedules page with a paused schedule and its action icons."/>
             <wp:cNvGraphicFramePr>
               <a:graphicFrameLocks xmlns:a="http://schemas.openxmlformats.org/drawingml/2006/main" noChangeAspect="1"/>
             </wp:cNvGraphicFramePr>
@@ -19577,7 +19577,7 @@
       <w:pPr>
         <w:pStyle w:val="Ttulo2"/>
       </w:pPr>
-      <w:bookmarkStart w:id="28" w:name="_Toc241692009"/>
+      <w:bookmarkStart w:id="28" w:name="_Toc241692621"/>
       <w:r>
         <w:t>Example: schedule a weekly run</w:t>
       </w:r>
@@ -19743,7 +19743,7 @@
         <w:pStyle w:val="Ttulo1"/>
         <w:pageBreakBefore/>
       </w:pPr>
-      <w:bookmarkStart w:id="29" w:name="_Toc241692010"/>
+      <w:bookmarkStart w:id="29" w:name="_Toc241692622"/>
       <w:r>
         <w:lastRenderedPageBreak/>
         <w:t>Runs</w:t>
@@ -19773,10 +19773,10 @@
           <w:noProof/>
         </w:rPr>
         <w:drawing>
-          <wp:inline distT="0" distB="0" distL="0" distR="0" wp14:anchorId="2E3F7E5F" wp14:editId="54DFD202">
+          <wp:inline distT="0" distB="0" distL="0" distR="0" wp14:anchorId="3720D158" wp14:editId="010BF6BD">
             <wp:extent cx="5715000" cy="3571875"/>
             <wp:effectExtent l="0" t="0" r="0" b="0"/>
-            <wp:docPr id="209" name="10-runs.png" descr="The Runs page with map, status and kind filters and the list of runs." title="The Runs page with map, status and kind filters and the list of runs."/>
+            <wp:docPr id="13" name="10-runs.png" descr="The Runs page with map, status and kind filters and the list of runs." title="The Runs page with map, status and kind filters and the list of runs."/>
             <wp:cNvGraphicFramePr>
               <a:graphicFrameLocks xmlns:a="http://schemas.openxmlformats.org/drawingml/2006/main" noChangeAspect="1"/>
             </wp:cNvGraphicFramePr>
@@ -20494,7 +20494,7 @@
         <w:pStyle w:val="Ttulo1"/>
         <w:pageBreakBefore/>
       </w:pPr>
-      <w:bookmarkStart w:id="30" w:name="_Toc241692011"/>
+      <w:bookmarkStart w:id="30" w:name="_Toc241692623"/>
       <w:r>
         <w:lastRenderedPageBreak/>
         <w:t>Exports</w:t>
@@ -20524,10 +20524,10 @@
           <w:noProof/>
         </w:rPr>
         <w:drawing>
-          <wp:inline distT="0" distB="0" distL="0" distR="0" wp14:anchorId="29888C37" wp14:editId="7677ECA0">
+          <wp:inline distT="0" distB="0" distL="0" distR="0" wp14:anchorId="43055500" wp14:editId="3E9ABE83">
             <wp:extent cx="5715000" cy="3571875"/>
             <wp:effectExtent l="0" t="0" r="0" b="0"/>
-            <wp:docPr id="210" name="44-exports.png" descr="The Exports page listing export jobs with a Download button on finished ones." title="The Exports page listing export jobs with a Download button on finished ones."/>
+            <wp:docPr id="14" name="44-exports.png" descr="The Exports page listing export jobs with a Download button on finished ones." title="The Exports page listing export jobs with a Download button on finished ones."/>
             <wp:cNvGraphicFramePr>
               <a:graphicFrameLocks xmlns:a="http://schemas.openxmlformats.org/drawingml/2006/main" noChangeAspect="1"/>
             </wp:cNvGraphicFramePr>
@@ -20801,7 +20801,7 @@
         <w:pStyle w:val="Ttulo1"/>
         <w:pageBreakBefore/>
       </w:pPr>
-      <w:bookmarkStart w:id="31" w:name="_Toc241692012"/>
+      <w:bookmarkStart w:id="31" w:name="_Toc241692624"/>
       <w:r>
         <w:lastRenderedPageBreak/>
         <w:t>Settings</w:t>
@@ -20844,10 +20844,10 @@
           <w:noProof/>
         </w:rPr>
         <w:drawing>
-          <wp:inline distT="0" distB="0" distL="0" distR="0" wp14:anchorId="71BD9D60" wp14:editId="124B5168">
+          <wp:inline distT="0" distB="0" distL="0" distR="0" wp14:anchorId="518B80E7" wp14:editId="6FDD0B89">
             <wp:extent cx="5715000" cy="3571875"/>
             <wp:effectExtent l="0" t="0" r="0" b="0"/>
-            <wp:docPr id="211" name="04-settings.png" descr="The Settings page with the Language, Theme and Color palette cards." title="The Settings page with the Language, Theme and Color palette cards."/>
+            <wp:docPr id="15" name="04-settings.png" descr="The Settings page with the Language, Theme and Color palette cards." title="The Settings page with the Language, Theme and Color palette cards."/>
             <wp:cNvGraphicFramePr>
               <a:graphicFrameLocks xmlns:a="http://schemas.openxmlformats.org/drawingml/2006/main" noChangeAspect="1"/>
             </wp:cNvGraphicFramePr>
@@ -21398,7 +21398,7 @@
         <w:pStyle w:val="Ttulo1"/>
         <w:pageBreakBefore/>
       </w:pPr>
-      <w:bookmarkStart w:id="32" w:name="_Toc241692013"/>
+      <w:bookmarkStart w:id="32" w:name="_Toc241692625"/>
       <w:r>
         <w:lastRenderedPageBreak/>
         <w:t>Common questions</w:t>
@@ -21598,7 +21598,7 @@
         <w:pStyle w:val="Ttulo1"/>
         <w:pageBreakBefore/>
       </w:pPr>
-      <w:bookmarkStart w:id="33" w:name="_Toc241692014"/>
+      <w:bookmarkStart w:id="33" w:name="_Toc241692626"/>
       <w:r>
         <w:lastRenderedPageBreak/>
         <w:t>Glossary</w:t>
@@ -22808,10 +22808,416 @@
 <file path=word/numbering.xml><?xml version="1.0" encoding="utf-8"?>
 <w:numbering xmlns:wpc="http://schemas.microsoft.com/office/word/2010/wordprocessingCanvas" xmlns:cx="http://schemas.microsoft.com/office/drawing/2014/chartex" xmlns:cx1="http://schemas.microsoft.com/office/drawing/2015/9/8/chartex" xmlns:cx2="http://schemas.microsoft.com/office/drawing/2015/10/21/chartex" xmlns:cx3="http://schemas.microsoft.com/office/drawing/2016/5/9/chartex" xmlns:cx4="http://schemas.microsoft.com/office/drawing/2016/5/10/chartex" xmlns:cx5="http://schemas.microsoft.com/office/drawing/2016/5/11/chartex" xmlns:cx6="http://schemas.microsoft.com/office/drawing/2016/5/12/chartex" xmlns:cx7="http://schemas.microsoft.com/office/drawing/2016/5/13/chartex" xmlns:cx8="http://schemas.microsoft.com/office/drawing/2016/5/14/chartex" xmlns:mc="http://schemas.openxmlformats.org/markup-compatibility/2006" xmlns:aink="http://schemas.microsoft.com/office/drawing/2016/ink" xmlns:am3d="http://schemas.microsoft.com/office/drawing/2017/model3d" xmlns:o="urn:schemas-microsoft-com:office:office" xmlns:oel="http://schemas.microsoft.com/office/2019/extlst" xmlns:r="http://schemas.openxmlformats.org/officeDocument/2006/relationships" xmlns:m="http://schemas.openxmlformats.org/officeDocument/2006/math" xmlns:v="urn:schemas-microsoft-com:vml" xmlns:wp14="http://schemas.microsoft.com/office/word/2010/wordprocessingDrawing" xmlns:wp="http://schemas.openxmlformats.org/drawingml/2006/wordprocessingDrawing" xmlns:w10="urn:schemas-microsoft-com:office:word" xmlns:w="http://schemas.openxmlformats.org/wordprocessingml/2006/main" xmlns:w14="http://schemas.microsoft.com/office/word/2010/wordml" xmlns:w15="http://schemas.microsoft.com/office/word/2012/wordml" xmlns:w16cex="http://schemas.microsoft.com/office/word/2018/wordml/cex" xmlns:w16cid="http://schemas.microsoft.com/office/word/2016/wordml/cid" xmlns:w16="http://schemas.microsoft.com/office/word/2018/wordml" xmlns:w16sdtdh="http://schemas.microsoft.com/office/word/2020/wordml/sdtdatahash" xmlns:w16se="http://schemas.microsoft.com/office/word/2015/wordml/symex" xmlns:wpg="http://schemas.microsoft.com/office/word/2010/wordprocessingGroup" xmlns:wpi="http://schemas.microsoft.com/office/word/2010/wordprocessingInk" xmlns:wne="http://schemas.microsoft.com/office/word/2006/wordml" xmlns:wps="http://schemas.microsoft.com/office/word/2010/wordprocessingShape" mc:Ignorable="w14 w15 w16se w16cid w16 w16cex w16sdtdh wp14">
   <w:abstractNum w:abstractNumId="0" w15:restartNumberingAfterBreak="0">
-    <w:nsid w:val="164512D0"/>
+    <w:nsid w:val="02983A16"/>
     <w:multiLevelType w:val="hybridMultilevel"/>
-    <w:tmpl w:val="CD106840"/>
-    <w:lvl w:ilvl="0" w:tplc="BFCEC206">
+    <w:tmpl w:val="1B2E3018"/>
+    <w:lvl w:ilvl="0" w:tplc="7938F88E">
+      <w:start w:val="1"/>
+      <w:numFmt w:val="decimal"/>
+      <w:lvlText w:val="%1."/>
+      <w:lvlJc w:val="left"/>
+      <w:pPr>
+        <w:ind w:left="360" w:hanging="300"/>
+      </w:pPr>
+    </w:lvl>
+    <w:lvl w:ilvl="1" w:tplc="16D2FC50" w:tentative="1">
+      <w:start w:val="1"/>
+      <w:numFmt w:val="lowerLetter"/>
+      <w:lvlText w:val="%2."/>
+      <w:lvlJc w:val="left"/>
+      <w:pPr>
+        <w:ind w:left="720" w:hanging="300"/>
+      </w:pPr>
+    </w:lvl>
+    <w:lvl w:ilvl="2" w:tplc="4C363708">
+      <w:numFmt w:val="decimal"/>
+      <w:lvlText w:val=""/>
+      <w:lvlJc w:val="left"/>
+    </w:lvl>
+    <w:lvl w:ilvl="3" w:tplc="A77E4112">
+      <w:numFmt w:val="decimal"/>
+      <w:lvlText w:val=""/>
+      <w:lvlJc w:val="left"/>
+    </w:lvl>
+    <w:lvl w:ilvl="4" w:tplc="E5A456CE">
+      <w:numFmt w:val="decimal"/>
+      <w:lvlText w:val=""/>
+      <w:lvlJc w:val="left"/>
+    </w:lvl>
+    <w:lvl w:ilvl="5" w:tplc="96D4AAE8">
+      <w:numFmt w:val="decimal"/>
+      <w:lvlText w:val=""/>
+      <w:lvlJc w:val="left"/>
+    </w:lvl>
+    <w:lvl w:ilvl="6" w:tplc="36A00572">
+      <w:numFmt w:val="decimal"/>
+      <w:lvlText w:val=""/>
+      <w:lvlJc w:val="left"/>
+    </w:lvl>
+    <w:lvl w:ilvl="7" w:tplc="40B84946">
+      <w:numFmt w:val="decimal"/>
+      <w:lvlText w:val=""/>
+      <w:lvlJc w:val="left"/>
+    </w:lvl>
+    <w:lvl w:ilvl="8" w:tplc="577A7C16">
+      <w:numFmt w:val="decimal"/>
+      <w:lvlText w:val=""/>
+      <w:lvlJc w:val="left"/>
+    </w:lvl>
+  </w:abstractNum>
+  <w:abstractNum w:abstractNumId="1" w15:restartNumberingAfterBreak="0">
+    <w:nsid w:val="20D83E72"/>
+    <w:multiLevelType w:val="hybridMultilevel"/>
+    <w:tmpl w:val="D7EAE828"/>
+    <w:lvl w:ilvl="0" w:tplc="E1B22CB6">
+      <w:start w:val="1"/>
+      <w:numFmt w:val="decimal"/>
+      <w:lvlText w:val="%1."/>
+      <w:lvlJc w:val="left"/>
+      <w:pPr>
+        <w:ind w:left="360" w:hanging="300"/>
+      </w:pPr>
+    </w:lvl>
+    <w:lvl w:ilvl="1" w:tplc="C2688064" w:tentative="1">
+      <w:start w:val="1"/>
+      <w:numFmt w:val="lowerLetter"/>
+      <w:lvlText w:val="%2."/>
+      <w:lvlJc w:val="left"/>
+      <w:pPr>
+        <w:ind w:left="720" w:hanging="300"/>
+      </w:pPr>
+    </w:lvl>
+    <w:lvl w:ilvl="2" w:tplc="11F4FC2E">
+      <w:numFmt w:val="decimal"/>
+      <w:lvlText w:val=""/>
+      <w:lvlJc w:val="left"/>
+    </w:lvl>
+    <w:lvl w:ilvl="3" w:tplc="14624C12">
+      <w:numFmt w:val="decimal"/>
+      <w:lvlText w:val=""/>
+      <w:lvlJc w:val="left"/>
+    </w:lvl>
+    <w:lvl w:ilvl="4" w:tplc="E4F670FC">
+      <w:numFmt w:val="decimal"/>
+      <w:lvlText w:val=""/>
+      <w:lvlJc w:val="left"/>
+    </w:lvl>
+    <w:lvl w:ilvl="5" w:tplc="11121AC8">
+      <w:numFmt w:val="decimal"/>
+      <w:lvlText w:val=""/>
+      <w:lvlJc w:val="left"/>
+    </w:lvl>
+    <w:lvl w:ilvl="6" w:tplc="EF18F01E">
+      <w:numFmt w:val="decimal"/>
+      <w:lvlText w:val=""/>
+      <w:lvlJc w:val="left"/>
+    </w:lvl>
+    <w:lvl w:ilvl="7" w:tplc="487412CC">
+      <w:numFmt w:val="decimal"/>
+      <w:lvlText w:val=""/>
+      <w:lvlJc w:val="left"/>
+    </w:lvl>
+    <w:lvl w:ilvl="8" w:tplc="6BF6144E">
+      <w:numFmt w:val="decimal"/>
+      <w:lvlText w:val=""/>
+      <w:lvlJc w:val="left"/>
+    </w:lvl>
+  </w:abstractNum>
+  <w:abstractNum w:abstractNumId="2" w15:restartNumberingAfterBreak="0">
+    <w:nsid w:val="27C85B20"/>
+    <w:multiLevelType w:val="hybridMultilevel"/>
+    <w:tmpl w:val="580AF4D6"/>
+    <w:lvl w:ilvl="0" w:tplc="5C5818EE">
+      <w:start w:val="1"/>
+      <w:numFmt w:val="decimal"/>
+      <w:lvlText w:val="%1."/>
+      <w:lvlJc w:val="left"/>
+      <w:pPr>
+        <w:ind w:left="360" w:hanging="300"/>
+      </w:pPr>
+    </w:lvl>
+    <w:lvl w:ilvl="1" w:tplc="E068763A" w:tentative="1">
+      <w:start w:val="1"/>
+      <w:numFmt w:val="lowerLetter"/>
+      <w:lvlText w:val="%2."/>
+      <w:lvlJc w:val="left"/>
+      <w:pPr>
+        <w:ind w:left="720" w:hanging="300"/>
+      </w:pPr>
+    </w:lvl>
+    <w:lvl w:ilvl="2" w:tplc="16AE7DA2">
+      <w:numFmt w:val="decimal"/>
+      <w:lvlText w:val=""/>
+      <w:lvlJc w:val="left"/>
+    </w:lvl>
+    <w:lvl w:ilvl="3" w:tplc="38F0AD9C">
+      <w:numFmt w:val="decimal"/>
+      <w:lvlText w:val=""/>
+      <w:lvlJc w:val="left"/>
+    </w:lvl>
+    <w:lvl w:ilvl="4" w:tplc="B762D4EE">
+      <w:numFmt w:val="decimal"/>
+      <w:lvlText w:val=""/>
+      <w:lvlJc w:val="left"/>
+    </w:lvl>
+    <w:lvl w:ilvl="5" w:tplc="3336EE82">
+      <w:numFmt w:val="decimal"/>
+      <w:lvlText w:val=""/>
+      <w:lvlJc w:val="left"/>
+    </w:lvl>
+    <w:lvl w:ilvl="6" w:tplc="A8CE6E9C">
+      <w:numFmt w:val="decimal"/>
+      <w:lvlText w:val=""/>
+      <w:lvlJc w:val="left"/>
+    </w:lvl>
+    <w:lvl w:ilvl="7" w:tplc="CE66A81E">
+      <w:numFmt w:val="decimal"/>
+      <w:lvlText w:val=""/>
+      <w:lvlJc w:val="left"/>
+    </w:lvl>
+    <w:lvl w:ilvl="8" w:tplc="30E8B048">
+      <w:numFmt w:val="decimal"/>
+      <w:lvlText w:val=""/>
+      <w:lvlJc w:val="left"/>
+    </w:lvl>
+  </w:abstractNum>
+  <w:abstractNum w:abstractNumId="3" w15:restartNumberingAfterBreak="0">
+    <w:nsid w:val="2AF52872"/>
+    <w:multiLevelType w:val="hybridMultilevel"/>
+    <w:tmpl w:val="B6D459EE"/>
+    <w:lvl w:ilvl="0" w:tplc="72EAE118">
+      <w:start w:val="1"/>
+      <w:numFmt w:val="decimal"/>
+      <w:lvlText w:val="%1."/>
+      <w:lvlJc w:val="left"/>
+      <w:pPr>
+        <w:ind w:left="360" w:hanging="300"/>
+      </w:pPr>
+    </w:lvl>
+    <w:lvl w:ilvl="1" w:tplc="E55A5998" w:tentative="1">
+      <w:start w:val="1"/>
+      <w:numFmt w:val="lowerLetter"/>
+      <w:lvlText w:val="%2."/>
+      <w:lvlJc w:val="left"/>
+      <w:pPr>
+        <w:ind w:left="720" w:hanging="300"/>
+      </w:pPr>
+    </w:lvl>
+    <w:lvl w:ilvl="2" w:tplc="86A62E2A">
+      <w:numFmt w:val="decimal"/>
+      <w:lvlText w:val=""/>
+      <w:lvlJc w:val="left"/>
+    </w:lvl>
+    <w:lvl w:ilvl="3" w:tplc="5F0815F4">
+      <w:numFmt w:val="decimal"/>
+      <w:lvlText w:val=""/>
+      <w:lvlJc w:val="left"/>
+    </w:lvl>
+    <w:lvl w:ilvl="4" w:tplc="A644EB74">
+      <w:numFmt w:val="decimal"/>
+      <w:lvlText w:val=""/>
+      <w:lvlJc w:val="left"/>
+    </w:lvl>
+    <w:lvl w:ilvl="5" w:tplc="7CF2F0DC">
+      <w:numFmt w:val="decimal"/>
+      <w:lvlText w:val=""/>
+      <w:lvlJc w:val="left"/>
+    </w:lvl>
+    <w:lvl w:ilvl="6" w:tplc="E63E8856">
+      <w:numFmt w:val="decimal"/>
+      <w:lvlText w:val=""/>
+      <w:lvlJc w:val="left"/>
+    </w:lvl>
+    <w:lvl w:ilvl="7" w:tplc="BE5EC232">
+      <w:numFmt w:val="decimal"/>
+      <w:lvlText w:val=""/>
+      <w:lvlJc w:val="left"/>
+    </w:lvl>
+    <w:lvl w:ilvl="8" w:tplc="95740FE8">
+      <w:numFmt w:val="decimal"/>
+      <w:lvlText w:val=""/>
+      <w:lvlJc w:val="left"/>
+    </w:lvl>
+  </w:abstractNum>
+  <w:abstractNum w:abstractNumId="4" w15:restartNumberingAfterBreak="0">
+    <w:nsid w:val="2BC448C8"/>
+    <w:multiLevelType w:val="hybridMultilevel"/>
+    <w:tmpl w:val="B4444266"/>
+    <w:lvl w:ilvl="0" w:tplc="8DDEF5C4">
+      <w:start w:val="1"/>
+      <w:numFmt w:val="decimal"/>
+      <w:lvlText w:val="%1."/>
+      <w:lvlJc w:val="left"/>
+      <w:pPr>
+        <w:ind w:left="360" w:hanging="300"/>
+      </w:pPr>
+    </w:lvl>
+    <w:lvl w:ilvl="1" w:tplc="00E0F20E" w:tentative="1">
+      <w:start w:val="1"/>
+      <w:numFmt w:val="lowerLetter"/>
+      <w:lvlText w:val="%2."/>
+      <w:lvlJc w:val="left"/>
+      <w:pPr>
+        <w:ind w:left="720" w:hanging="300"/>
+      </w:pPr>
+    </w:lvl>
+    <w:lvl w:ilvl="2" w:tplc="8440FADE">
+      <w:numFmt w:val="decimal"/>
+      <w:lvlText w:val=""/>
+      <w:lvlJc w:val="left"/>
+    </w:lvl>
+    <w:lvl w:ilvl="3" w:tplc="A322C9E2">
+      <w:numFmt w:val="decimal"/>
+      <w:lvlText w:val=""/>
+      <w:lvlJc w:val="left"/>
+    </w:lvl>
+    <w:lvl w:ilvl="4" w:tplc="8236C1D6">
+      <w:numFmt w:val="decimal"/>
+      <w:lvlText w:val=""/>
+      <w:lvlJc w:val="left"/>
+    </w:lvl>
+    <w:lvl w:ilvl="5" w:tplc="CAACA316">
+      <w:numFmt w:val="decimal"/>
+      <w:lvlText w:val=""/>
+      <w:lvlJc w:val="left"/>
+    </w:lvl>
+    <w:lvl w:ilvl="6" w:tplc="1EA88698">
+      <w:numFmt w:val="decimal"/>
+      <w:lvlText w:val=""/>
+      <w:lvlJc w:val="left"/>
+    </w:lvl>
+    <w:lvl w:ilvl="7" w:tplc="F198F3F0">
+      <w:numFmt w:val="decimal"/>
+      <w:lvlText w:val=""/>
+      <w:lvlJc w:val="left"/>
+    </w:lvl>
+    <w:lvl w:ilvl="8" w:tplc="D6CA92FA">
+      <w:numFmt w:val="decimal"/>
+      <w:lvlText w:val=""/>
+      <w:lvlJc w:val="left"/>
+    </w:lvl>
+  </w:abstractNum>
+  <w:abstractNum w:abstractNumId="5" w15:restartNumberingAfterBreak="0">
+    <w:nsid w:val="32510ADC"/>
+    <w:multiLevelType w:val="hybridMultilevel"/>
+    <w:tmpl w:val="725E09B0"/>
+    <w:lvl w:ilvl="0" w:tplc="E3B2C62A">
+      <w:start w:val="1"/>
+      <w:numFmt w:val="decimal"/>
+      <w:lvlText w:val="%1."/>
+      <w:lvlJc w:val="left"/>
+      <w:pPr>
+        <w:ind w:left="360" w:hanging="300"/>
+      </w:pPr>
+    </w:lvl>
+    <w:lvl w:ilvl="1" w:tplc="E41463AC" w:tentative="1">
+      <w:start w:val="1"/>
+      <w:numFmt w:val="lowerLetter"/>
+      <w:lvlText w:val="%2."/>
+      <w:lvlJc w:val="left"/>
+      <w:pPr>
+        <w:ind w:left="720" w:hanging="300"/>
+      </w:pPr>
+    </w:lvl>
+    <w:lvl w:ilvl="2" w:tplc="2A28AEB4">
+      <w:numFmt w:val="decimal"/>
+      <w:lvlText w:val=""/>
+      <w:lvlJc w:val="left"/>
+    </w:lvl>
+    <w:lvl w:ilvl="3" w:tplc="C73CF762">
+      <w:numFmt w:val="decimal"/>
+      <w:lvlText w:val=""/>
+      <w:lvlJc w:val="left"/>
+    </w:lvl>
+    <w:lvl w:ilvl="4" w:tplc="250A5D48">
+      <w:numFmt w:val="decimal"/>
+      <w:lvlText w:val=""/>
+      <w:lvlJc w:val="left"/>
+    </w:lvl>
+    <w:lvl w:ilvl="5" w:tplc="29422994">
+      <w:numFmt w:val="decimal"/>
+      <w:lvlText w:val=""/>
+      <w:lvlJc w:val="left"/>
+    </w:lvl>
+    <w:lvl w:ilvl="6" w:tplc="5C267B60">
+      <w:numFmt w:val="decimal"/>
+      <w:lvlText w:val=""/>
+      <w:lvlJc w:val="left"/>
+    </w:lvl>
+    <w:lvl w:ilvl="7" w:tplc="AF0A9A82">
+      <w:numFmt w:val="decimal"/>
+      <w:lvlText w:val=""/>
+      <w:lvlJc w:val="left"/>
+    </w:lvl>
+    <w:lvl w:ilvl="8" w:tplc="1BA00BCA">
+      <w:numFmt w:val="decimal"/>
+      <w:lvlText w:val=""/>
+      <w:lvlJc w:val="left"/>
+    </w:lvl>
+  </w:abstractNum>
+  <w:abstractNum w:abstractNumId="6" w15:restartNumberingAfterBreak="0">
+    <w:nsid w:val="34141E05"/>
+    <w:multiLevelType w:val="hybridMultilevel"/>
+    <w:tmpl w:val="DC0E8076"/>
+    <w:lvl w:ilvl="0" w:tplc="ADAAC852">
+      <w:start w:val="1"/>
+      <w:numFmt w:val="decimal"/>
+      <w:lvlText w:val="%1."/>
+      <w:lvlJc w:val="left"/>
+      <w:pPr>
+        <w:ind w:left="360" w:hanging="300"/>
+      </w:pPr>
+    </w:lvl>
+    <w:lvl w:ilvl="1" w:tplc="9EB4E66E" w:tentative="1">
+      <w:start w:val="1"/>
+      <w:numFmt w:val="lowerLetter"/>
+      <w:lvlText w:val="%2."/>
+      <w:lvlJc w:val="left"/>
+      <w:pPr>
+        <w:ind w:left="720" w:hanging="300"/>
+      </w:pPr>
+    </w:lvl>
+    <w:lvl w:ilvl="2" w:tplc="A808C46E">
+      <w:numFmt w:val="decimal"/>
+      <w:lvlText w:val=""/>
+      <w:lvlJc w:val="left"/>
+    </w:lvl>
+    <w:lvl w:ilvl="3" w:tplc="5498B6E4">
+      <w:numFmt w:val="decimal"/>
+      <w:lvlText w:val=""/>
+      <w:lvlJc w:val="left"/>
+    </w:lvl>
+    <w:lvl w:ilvl="4" w:tplc="EA66F7B4">
+      <w:numFmt w:val="decimal"/>
+      <w:lvlText w:val=""/>
+      <w:lvlJc w:val="left"/>
+    </w:lvl>
+    <w:lvl w:ilvl="5" w:tplc="4CA6D140">
+      <w:numFmt w:val="decimal"/>
+      <w:lvlText w:val=""/>
+      <w:lvlJc w:val="left"/>
+    </w:lvl>
+    <w:lvl w:ilvl="6" w:tplc="1B54BE46">
+      <w:numFmt w:val="decimal"/>
+      <w:lvlText w:val=""/>
+      <w:lvlJc w:val="left"/>
+    </w:lvl>
+    <w:lvl w:ilvl="7" w:tplc="00C021DE">
+      <w:numFmt w:val="decimal"/>
+      <w:lvlText w:val=""/>
+      <w:lvlJc w:val="left"/>
+    </w:lvl>
+    <w:lvl w:ilvl="8" w:tplc="87CE8450">
+      <w:numFmt w:val="decimal"/>
+      <w:lvlText w:val=""/>
+      <w:lvlJc w:val="left"/>
+    </w:lvl>
+  </w:abstractNum>
+  <w:abstractNum w:abstractNumId="7" w15:restartNumberingAfterBreak="0">
+    <w:nsid w:val="584C31E4"/>
+    <w:multiLevelType w:val="hybridMultilevel"/>
+    <w:tmpl w:val="7B142B72"/>
+    <w:lvl w:ilvl="0" w:tplc="14405026">
       <w:start w:val="1"/>
       <w:numFmt w:val="bullet"/>
       <w:lvlText w:val="•"/>
@@ -22820,7 +23226,7 @@
         <w:ind w:left="360" w:hanging="260"/>
       </w:pPr>
     </w:lvl>
-    <w:lvl w:ilvl="1" w:tplc="E3F6FDAC" w:tentative="1">
+    <w:lvl w:ilvl="1" w:tplc="35E86E9C" w:tentative="1">
       <w:start w:val="1"/>
       <w:numFmt w:val="bullet"/>
       <w:lvlText w:val="–"/>
@@ -22829,47 +23235,47 @@
         <w:ind w:left="720" w:hanging="260"/>
       </w:pPr>
     </w:lvl>
-    <w:lvl w:ilvl="2" w:tplc="4B3816D0">
+    <w:lvl w:ilvl="2" w:tplc="B9C663B0">
       <w:numFmt w:val="decimal"/>
       <w:lvlText w:val=""/>
       <w:lvlJc w:val="left"/>
     </w:lvl>
-    <w:lvl w:ilvl="3" w:tplc="73944F0C">
+    <w:lvl w:ilvl="3" w:tplc="B5BA0ECA">
       <w:numFmt w:val="decimal"/>
       <w:lvlText w:val=""/>
       <w:lvlJc w:val="left"/>
     </w:lvl>
-    <w:lvl w:ilvl="4" w:tplc="F7925B90">
+    <w:lvl w:ilvl="4" w:tplc="B73623FE">
       <w:numFmt w:val="decimal"/>
       <w:lvlText w:val=""/>
       <w:lvlJc w:val="left"/>
     </w:lvl>
-    <w:lvl w:ilvl="5" w:tplc="019E8976">
+    <w:lvl w:ilvl="5" w:tplc="2BA6F05C">
       <w:numFmt w:val="decimal"/>
       <w:lvlText w:val=""/>
       <w:lvlJc w:val="left"/>
     </w:lvl>
-    <w:lvl w:ilvl="6" w:tplc="F6A6E312">
+    <w:lvl w:ilvl="6" w:tplc="BCC8BA02">
       <w:numFmt w:val="decimal"/>
       <w:lvlText w:val=""/>
       <w:lvlJc w:val="left"/>
     </w:lvl>
-    <w:lvl w:ilvl="7" w:tplc="C1624ADE">
+    <w:lvl w:ilvl="7" w:tplc="558C5E96">
       <w:numFmt w:val="decimal"/>
       <w:lvlText w:val=""/>
       <w:lvlJc w:val="left"/>
     </w:lvl>
-    <w:lvl w:ilvl="8" w:tplc="9B105990">
+    <w:lvl w:ilvl="8" w:tplc="19401FD2">
       <w:numFmt w:val="decimal"/>
       <w:lvlText w:val=""/>
       <w:lvlJc w:val="left"/>
     </w:lvl>
   </w:abstractNum>
-  <w:abstractNum w:abstractNumId="1" w15:restartNumberingAfterBreak="0">
-    <w:nsid w:val="21B72E9A"/>
+  <w:abstractNum w:abstractNumId="8" w15:restartNumberingAfterBreak="0">
+    <w:nsid w:val="78EA0631"/>
     <w:multiLevelType w:val="hybridMultilevel"/>
-    <w:tmpl w:val="04F6962C"/>
-    <w:lvl w:ilvl="0" w:tplc="BCCECAB8">
+    <w:tmpl w:val="771E2E34"/>
+    <w:lvl w:ilvl="0" w:tplc="E3C00140">
       <w:start w:val="1"/>
       <w:numFmt w:val="decimal"/>
       <w:lvlText w:val="%1."/>
@@ -22878,7 +23284,7 @@
         <w:ind w:left="360" w:hanging="300"/>
       </w:pPr>
     </w:lvl>
-    <w:lvl w:ilvl="1" w:tplc="97506A1A" w:tentative="1">
+    <w:lvl w:ilvl="1" w:tplc="71E00748" w:tentative="1">
       <w:start w:val="1"/>
       <w:numFmt w:val="lowerLetter"/>
       <w:lvlText w:val="%2."/>
@@ -22887,337 +23293,47 @@
         <w:ind w:left="720" w:hanging="300"/>
       </w:pPr>
     </w:lvl>
-    <w:lvl w:ilvl="2" w:tplc="E1B69E36">
+    <w:lvl w:ilvl="2" w:tplc="B04CC738">
       <w:numFmt w:val="decimal"/>
       <w:lvlText w:val=""/>
       <w:lvlJc w:val="left"/>
     </w:lvl>
-    <w:lvl w:ilvl="3" w:tplc="1FA445C0">
+    <w:lvl w:ilvl="3" w:tplc="51A469E8">
       <w:numFmt w:val="decimal"/>
       <w:lvlText w:val=""/>
       <w:lvlJc w:val="left"/>
     </w:lvl>
-    <w:lvl w:ilvl="4" w:tplc="2DD00F18">
+    <w:lvl w:ilvl="4" w:tplc="6E1ED09C">
       <w:numFmt w:val="decimal"/>
       <w:lvlText w:val=""/>
       <w:lvlJc w:val="left"/>
     </w:lvl>
-    <w:lvl w:ilvl="5" w:tplc="675A8274">
+    <w:lvl w:ilvl="5" w:tplc="B1B29334">
       <w:numFmt w:val="decimal"/>
       <w:lvlText w:val=""/>
       <w:lvlJc w:val="left"/>
     </w:lvl>
-    <w:lvl w:ilvl="6" w:tplc="2BC4810A">
+    <w:lvl w:ilvl="6" w:tplc="BC8CB5E8">
       <w:numFmt w:val="decimal"/>
       <w:lvlText w:val=""/>
       <w:lvlJc w:val="left"/>
     </w:lvl>
-    <w:lvl w:ilvl="7" w:tplc="DC181018">
+    <w:lvl w:ilvl="7" w:tplc="08D4FD42">
       <w:numFmt w:val="decimal"/>
       <w:lvlText w:val=""/>
       <w:lvlJc w:val="left"/>
     </w:lvl>
-    <w:lvl w:ilvl="8" w:tplc="CCBCC88C">
+    <w:lvl w:ilvl="8" w:tplc="5818EEB6">
       <w:numFmt w:val="decimal"/>
       <w:lvlText w:val=""/>
       <w:lvlJc w:val="left"/>
     </w:lvl>
   </w:abstractNum>
-  <w:abstractNum w:abstractNumId="2" w15:restartNumberingAfterBreak="0">
-    <w:nsid w:val="2D76390E"/>
+  <w:abstractNum w:abstractNumId="9" w15:restartNumberingAfterBreak="0">
+    <w:nsid w:val="7A1E2419"/>
     <w:multiLevelType w:val="hybridMultilevel"/>
-    <w:tmpl w:val="36F49EDA"/>
-    <w:lvl w:ilvl="0" w:tplc="9FD2C16C">
-      <w:start w:val="1"/>
-      <w:numFmt w:val="decimal"/>
-      <w:lvlText w:val="%1."/>
-      <w:lvlJc w:val="left"/>
-      <w:pPr>
-        <w:ind w:left="360" w:hanging="300"/>
-      </w:pPr>
-    </w:lvl>
-    <w:lvl w:ilvl="1" w:tplc="D39CC8E4" w:tentative="1">
-      <w:start w:val="1"/>
-      <w:numFmt w:val="lowerLetter"/>
-      <w:lvlText w:val="%2."/>
-      <w:lvlJc w:val="left"/>
-      <w:pPr>
-        <w:ind w:left="720" w:hanging="300"/>
-      </w:pPr>
-    </w:lvl>
-    <w:lvl w:ilvl="2" w:tplc="654C799C">
-      <w:numFmt w:val="decimal"/>
-      <w:lvlText w:val=""/>
-      <w:lvlJc w:val="left"/>
-    </w:lvl>
-    <w:lvl w:ilvl="3" w:tplc="E1529626">
-      <w:numFmt w:val="decimal"/>
-      <w:lvlText w:val=""/>
-      <w:lvlJc w:val="left"/>
-    </w:lvl>
-    <w:lvl w:ilvl="4" w:tplc="9C144300">
-      <w:numFmt w:val="decimal"/>
-      <w:lvlText w:val=""/>
-      <w:lvlJc w:val="left"/>
-    </w:lvl>
-    <w:lvl w:ilvl="5" w:tplc="CF743CEA">
-      <w:numFmt w:val="decimal"/>
-      <w:lvlText w:val=""/>
-      <w:lvlJc w:val="left"/>
-    </w:lvl>
-    <w:lvl w:ilvl="6" w:tplc="33E8A922">
-      <w:numFmt w:val="decimal"/>
-      <w:lvlText w:val=""/>
-      <w:lvlJc w:val="left"/>
-    </w:lvl>
-    <w:lvl w:ilvl="7" w:tplc="FF6A3B54">
-      <w:numFmt w:val="decimal"/>
-      <w:lvlText w:val=""/>
-      <w:lvlJc w:val="left"/>
-    </w:lvl>
-    <w:lvl w:ilvl="8" w:tplc="6C80059E">
-      <w:numFmt w:val="decimal"/>
-      <w:lvlText w:val=""/>
-      <w:lvlJc w:val="left"/>
-    </w:lvl>
-  </w:abstractNum>
-  <w:abstractNum w:abstractNumId="3" w15:restartNumberingAfterBreak="0">
-    <w:nsid w:val="3F527E1F"/>
-    <w:multiLevelType w:val="hybridMultilevel"/>
-    <w:tmpl w:val="7E3C3386"/>
-    <w:lvl w:ilvl="0" w:tplc="2976EC68">
-      <w:start w:val="1"/>
-      <w:numFmt w:val="decimal"/>
-      <w:lvlText w:val="%1."/>
-      <w:lvlJc w:val="left"/>
-      <w:pPr>
-        <w:ind w:left="360" w:hanging="300"/>
-      </w:pPr>
-    </w:lvl>
-    <w:lvl w:ilvl="1" w:tplc="F0CC704C" w:tentative="1">
-      <w:start w:val="1"/>
-      <w:numFmt w:val="lowerLetter"/>
-      <w:lvlText w:val="%2."/>
-      <w:lvlJc w:val="left"/>
-      <w:pPr>
-        <w:ind w:left="720" w:hanging="300"/>
-      </w:pPr>
-    </w:lvl>
-    <w:lvl w:ilvl="2" w:tplc="7B422704">
-      <w:numFmt w:val="decimal"/>
-      <w:lvlText w:val=""/>
-      <w:lvlJc w:val="left"/>
-    </w:lvl>
-    <w:lvl w:ilvl="3" w:tplc="331E9036">
-      <w:numFmt w:val="decimal"/>
-      <w:lvlText w:val=""/>
-      <w:lvlJc w:val="left"/>
-    </w:lvl>
-    <w:lvl w:ilvl="4" w:tplc="D832AC48">
-      <w:numFmt w:val="decimal"/>
-      <w:lvlText w:val=""/>
-      <w:lvlJc w:val="left"/>
-    </w:lvl>
-    <w:lvl w:ilvl="5" w:tplc="FB7424AA">
-      <w:numFmt w:val="decimal"/>
-      <w:lvlText w:val=""/>
-      <w:lvlJc w:val="left"/>
-    </w:lvl>
-    <w:lvl w:ilvl="6" w:tplc="16D41956">
-      <w:numFmt w:val="decimal"/>
-      <w:lvlText w:val=""/>
-      <w:lvlJc w:val="left"/>
-    </w:lvl>
-    <w:lvl w:ilvl="7" w:tplc="6D140D6C">
-      <w:numFmt w:val="decimal"/>
-      <w:lvlText w:val=""/>
-      <w:lvlJc w:val="left"/>
-    </w:lvl>
-    <w:lvl w:ilvl="8" w:tplc="2DD4AAE2">
-      <w:numFmt w:val="decimal"/>
-      <w:lvlText w:val=""/>
-      <w:lvlJc w:val="left"/>
-    </w:lvl>
-  </w:abstractNum>
-  <w:abstractNum w:abstractNumId="4" w15:restartNumberingAfterBreak="0">
-    <w:nsid w:val="3FF85A31"/>
-    <w:multiLevelType w:val="hybridMultilevel"/>
-    <w:tmpl w:val="C358972A"/>
-    <w:lvl w:ilvl="0" w:tplc="B97E8D4C">
-      <w:start w:val="1"/>
-      <w:numFmt w:val="decimal"/>
-      <w:lvlText w:val="%1."/>
-      <w:lvlJc w:val="left"/>
-      <w:pPr>
-        <w:ind w:left="360" w:hanging="300"/>
-      </w:pPr>
-    </w:lvl>
-    <w:lvl w:ilvl="1" w:tplc="084C8962" w:tentative="1">
-      <w:start w:val="1"/>
-      <w:numFmt w:val="lowerLetter"/>
-      <w:lvlText w:val="%2."/>
-      <w:lvlJc w:val="left"/>
-      <w:pPr>
-        <w:ind w:left="720" w:hanging="300"/>
-      </w:pPr>
-    </w:lvl>
-    <w:lvl w:ilvl="2" w:tplc="E16C91EA">
-      <w:numFmt w:val="decimal"/>
-      <w:lvlText w:val=""/>
-      <w:lvlJc w:val="left"/>
-    </w:lvl>
-    <w:lvl w:ilvl="3" w:tplc="35D44CF8">
-      <w:numFmt w:val="decimal"/>
-      <w:lvlText w:val=""/>
-      <w:lvlJc w:val="left"/>
-    </w:lvl>
-    <w:lvl w:ilvl="4" w:tplc="1BBC6F42">
-      <w:numFmt w:val="decimal"/>
-      <w:lvlText w:val=""/>
-      <w:lvlJc w:val="left"/>
-    </w:lvl>
-    <w:lvl w:ilvl="5" w:tplc="D6CCF3CE">
-      <w:numFmt w:val="decimal"/>
-      <w:lvlText w:val=""/>
-      <w:lvlJc w:val="left"/>
-    </w:lvl>
-    <w:lvl w:ilvl="6" w:tplc="E08E6356">
-      <w:numFmt w:val="decimal"/>
-      <w:lvlText w:val=""/>
-      <w:lvlJc w:val="left"/>
-    </w:lvl>
-    <w:lvl w:ilvl="7" w:tplc="76D8A8B0">
-      <w:numFmt w:val="decimal"/>
-      <w:lvlText w:val=""/>
-      <w:lvlJc w:val="left"/>
-    </w:lvl>
-    <w:lvl w:ilvl="8" w:tplc="DE3C3F7A">
-      <w:numFmt w:val="decimal"/>
-      <w:lvlText w:val=""/>
-      <w:lvlJc w:val="left"/>
-    </w:lvl>
-  </w:abstractNum>
-  <w:abstractNum w:abstractNumId="5" w15:restartNumberingAfterBreak="0">
-    <w:nsid w:val="510453C1"/>
-    <w:multiLevelType w:val="hybridMultilevel"/>
-    <w:tmpl w:val="D60E5D6A"/>
-    <w:lvl w:ilvl="0" w:tplc="0DBAF508">
-      <w:start w:val="1"/>
-      <w:numFmt w:val="decimal"/>
-      <w:lvlText w:val="%1."/>
-      <w:lvlJc w:val="left"/>
-      <w:pPr>
-        <w:ind w:left="360" w:hanging="300"/>
-      </w:pPr>
-    </w:lvl>
-    <w:lvl w:ilvl="1" w:tplc="BAE42EDE" w:tentative="1">
-      <w:start w:val="1"/>
-      <w:numFmt w:val="lowerLetter"/>
-      <w:lvlText w:val="%2."/>
-      <w:lvlJc w:val="left"/>
-      <w:pPr>
-        <w:ind w:left="720" w:hanging="300"/>
-      </w:pPr>
-    </w:lvl>
-    <w:lvl w:ilvl="2" w:tplc="6CFEB5E4">
-      <w:numFmt w:val="decimal"/>
-      <w:lvlText w:val=""/>
-      <w:lvlJc w:val="left"/>
-    </w:lvl>
-    <w:lvl w:ilvl="3" w:tplc="7C600DB2">
-      <w:numFmt w:val="decimal"/>
-      <w:lvlText w:val=""/>
-      <w:lvlJc w:val="left"/>
-    </w:lvl>
-    <w:lvl w:ilvl="4" w:tplc="EB1C2DD2">
-      <w:numFmt w:val="decimal"/>
-      <w:lvlText w:val=""/>
-      <w:lvlJc w:val="left"/>
-    </w:lvl>
-    <w:lvl w:ilvl="5" w:tplc="2BA4AC6C">
-      <w:numFmt w:val="decimal"/>
-      <w:lvlText w:val=""/>
-      <w:lvlJc w:val="left"/>
-    </w:lvl>
-    <w:lvl w:ilvl="6" w:tplc="52282C3E">
-      <w:numFmt w:val="decimal"/>
-      <w:lvlText w:val=""/>
-      <w:lvlJc w:val="left"/>
-    </w:lvl>
-    <w:lvl w:ilvl="7" w:tplc="8EEA3A60">
-      <w:numFmt w:val="decimal"/>
-      <w:lvlText w:val=""/>
-      <w:lvlJc w:val="left"/>
-    </w:lvl>
-    <w:lvl w:ilvl="8" w:tplc="CE3EA44A">
-      <w:numFmt w:val="decimal"/>
-      <w:lvlText w:val=""/>
-      <w:lvlJc w:val="left"/>
-    </w:lvl>
-  </w:abstractNum>
-  <w:abstractNum w:abstractNumId="6" w15:restartNumberingAfterBreak="0">
-    <w:nsid w:val="6C12443D"/>
-    <w:multiLevelType w:val="hybridMultilevel"/>
-    <w:tmpl w:val="349218D0"/>
-    <w:lvl w:ilvl="0" w:tplc="31C4A4B2">
-      <w:start w:val="1"/>
-      <w:numFmt w:val="decimal"/>
-      <w:lvlText w:val="%1."/>
-      <w:lvlJc w:val="left"/>
-      <w:pPr>
-        <w:ind w:left="360" w:hanging="300"/>
-      </w:pPr>
-    </w:lvl>
-    <w:lvl w:ilvl="1" w:tplc="AA7498E8" w:tentative="1">
-      <w:start w:val="1"/>
-      <w:numFmt w:val="lowerLetter"/>
-      <w:lvlText w:val="%2."/>
-      <w:lvlJc w:val="left"/>
-      <w:pPr>
-        <w:ind w:left="720" w:hanging="300"/>
-      </w:pPr>
-    </w:lvl>
-    <w:lvl w:ilvl="2" w:tplc="807CACC2">
-      <w:numFmt w:val="decimal"/>
-      <w:lvlText w:val=""/>
-      <w:lvlJc w:val="left"/>
-    </w:lvl>
-    <w:lvl w:ilvl="3" w:tplc="2F5A128C">
-      <w:numFmt w:val="decimal"/>
-      <w:lvlText w:val=""/>
-      <w:lvlJc w:val="left"/>
-    </w:lvl>
-    <w:lvl w:ilvl="4" w:tplc="CAF0EB60">
-      <w:numFmt w:val="decimal"/>
-      <w:lvlText w:val=""/>
-      <w:lvlJc w:val="left"/>
-    </w:lvl>
-    <w:lvl w:ilvl="5" w:tplc="4EBAC9FE">
-      <w:numFmt w:val="decimal"/>
-      <w:lvlText w:val=""/>
-      <w:lvlJc w:val="left"/>
-    </w:lvl>
-    <w:lvl w:ilvl="6" w:tplc="9B1AD43E">
-      <w:numFmt w:val="decimal"/>
-      <w:lvlText w:val=""/>
-      <w:lvlJc w:val="left"/>
-    </w:lvl>
-    <w:lvl w:ilvl="7" w:tplc="FDAC3DBE">
-      <w:numFmt w:val="decimal"/>
-      <w:lvlText w:val=""/>
-      <w:lvlJc w:val="left"/>
-    </w:lvl>
-    <w:lvl w:ilvl="8" w:tplc="1FB84ECC">
-      <w:numFmt w:val="decimal"/>
-      <w:lvlText w:val=""/>
-      <w:lvlJc w:val="left"/>
-    </w:lvl>
-  </w:abstractNum>
-  <w:abstractNum w:abstractNumId="7" w15:restartNumberingAfterBreak="0">
-    <w:nsid w:val="6C4C6D64"/>
-    <w:multiLevelType w:val="hybridMultilevel"/>
-    <w:tmpl w:val="B284ECF2"/>
-    <w:lvl w:ilvl="0" w:tplc="84728DE6" w:tentative="1">
+    <w:tmpl w:val="F524204A"/>
+    <w:lvl w:ilvl="0" w:tplc="3F366EB2" w:tentative="1">
       <w:start w:val="1"/>
       <w:numFmt w:val="bullet"/>
       <w:lvlText w:val="●"/>
@@ -23226,7 +23342,7 @@
         <w:ind w:left="720" w:hanging="360"/>
       </w:pPr>
     </w:lvl>
-    <w:lvl w:ilvl="1" w:tplc="4356C606" w:tentative="1">
+    <w:lvl w:ilvl="1" w:tplc="082CD0FA" w:tentative="1">
       <w:start w:val="1"/>
       <w:numFmt w:val="bullet"/>
       <w:lvlText w:val="○"/>
@@ -23235,7 +23351,7 @@
         <w:ind w:left="1440" w:hanging="360"/>
       </w:pPr>
     </w:lvl>
-    <w:lvl w:ilvl="2" w:tplc="7028112A" w:tentative="1">
+    <w:lvl w:ilvl="2" w:tplc="835E320E" w:tentative="1">
       <w:start w:val="1"/>
       <w:numFmt w:val="bullet"/>
       <w:lvlText w:val="■"/>
@@ -23244,7 +23360,7 @@
         <w:ind w:left="2160" w:hanging="360"/>
       </w:pPr>
     </w:lvl>
-    <w:lvl w:ilvl="3" w:tplc="D542F316" w:tentative="1">
+    <w:lvl w:ilvl="3" w:tplc="A2A2B24C" w:tentative="1">
       <w:start w:val="1"/>
       <w:numFmt w:val="bullet"/>
       <w:lvlText w:val="●"/>
@@ -23253,7 +23369,7 @@
         <w:ind w:left="2880" w:hanging="360"/>
       </w:pPr>
     </w:lvl>
-    <w:lvl w:ilvl="4" w:tplc="53C0812E" w:tentative="1">
+    <w:lvl w:ilvl="4" w:tplc="88F81C04" w:tentative="1">
       <w:start w:val="1"/>
       <w:numFmt w:val="bullet"/>
       <w:lvlText w:val="○"/>
@@ -23262,7 +23378,7 @@
         <w:ind w:left="3600" w:hanging="360"/>
       </w:pPr>
     </w:lvl>
-    <w:lvl w:ilvl="5" w:tplc="3CEEF0E0" w:tentative="1">
+    <w:lvl w:ilvl="5" w:tplc="10F04E12" w:tentative="1">
       <w:start w:val="1"/>
       <w:numFmt w:val="bullet"/>
       <w:lvlText w:val="■"/>
@@ -23271,7 +23387,7 @@
         <w:ind w:left="4320" w:hanging="360"/>
       </w:pPr>
     </w:lvl>
-    <w:lvl w:ilvl="6" w:tplc="5CC8BFA4" w:tentative="1">
+    <w:lvl w:ilvl="6" w:tplc="8B14FF4A" w:tentative="1">
       <w:start w:val="1"/>
       <w:numFmt w:val="bullet"/>
       <w:lvlText w:val="●"/>
@@ -23280,7 +23396,7 @@
         <w:ind w:left="5040" w:hanging="360"/>
       </w:pPr>
     </w:lvl>
-    <w:lvl w:ilvl="7" w:tplc="AD506F88" w:tentative="1">
+    <w:lvl w:ilvl="7" w:tplc="793EB738" w:tentative="1">
       <w:start w:val="1"/>
       <w:numFmt w:val="bullet"/>
       <w:lvlText w:val="●"/>
@@ -23289,7 +23405,7 @@
         <w:ind w:left="5760" w:hanging="360"/>
       </w:pPr>
     </w:lvl>
-    <w:lvl w:ilvl="8" w:tplc="1012E564" w:tentative="1">
+    <w:lvl w:ilvl="8" w:tplc="58A2B996" w:tentative="1">
       <w:start w:val="1"/>
       <w:numFmt w:val="bullet"/>
       <w:lvlText w:val="●"/>
@@ -23299,177 +23415,61 @@
       </w:pPr>
     </w:lvl>
   </w:abstractNum>
-  <w:abstractNum w:abstractNumId="8" w15:restartNumberingAfterBreak="0">
-    <w:nsid w:val="739855ED"/>
-    <w:multiLevelType w:val="hybridMultilevel"/>
-    <w:tmpl w:val="7C6CAA4A"/>
-    <w:lvl w:ilvl="0" w:tplc="46127C72">
-      <w:start w:val="1"/>
-      <w:numFmt w:val="decimal"/>
-      <w:lvlText w:val="%1."/>
-      <w:lvlJc w:val="left"/>
-      <w:pPr>
-        <w:ind w:left="360" w:hanging="300"/>
-      </w:pPr>
-    </w:lvl>
-    <w:lvl w:ilvl="1" w:tplc="7F5C6F40" w:tentative="1">
-      <w:start w:val="1"/>
-      <w:numFmt w:val="lowerLetter"/>
-      <w:lvlText w:val="%2."/>
-      <w:lvlJc w:val="left"/>
-      <w:pPr>
-        <w:ind w:left="720" w:hanging="300"/>
-      </w:pPr>
-    </w:lvl>
-    <w:lvl w:ilvl="2" w:tplc="5E8A70F2">
-      <w:numFmt w:val="decimal"/>
-      <w:lvlText w:val=""/>
-      <w:lvlJc w:val="left"/>
-    </w:lvl>
-    <w:lvl w:ilvl="3" w:tplc="5A501E02">
-      <w:numFmt w:val="decimal"/>
-      <w:lvlText w:val=""/>
-      <w:lvlJc w:val="left"/>
-    </w:lvl>
-    <w:lvl w:ilvl="4" w:tplc="7A8EF5D2">
-      <w:numFmt w:val="decimal"/>
-      <w:lvlText w:val=""/>
-      <w:lvlJc w:val="left"/>
-    </w:lvl>
-    <w:lvl w:ilvl="5" w:tplc="0D1C3804">
-      <w:numFmt w:val="decimal"/>
-      <w:lvlText w:val=""/>
-      <w:lvlJc w:val="left"/>
-    </w:lvl>
-    <w:lvl w:ilvl="6" w:tplc="52A4F532">
-      <w:numFmt w:val="decimal"/>
-      <w:lvlText w:val=""/>
-      <w:lvlJc w:val="left"/>
-    </w:lvl>
-    <w:lvl w:ilvl="7" w:tplc="0FCA113C">
-      <w:numFmt w:val="decimal"/>
-      <w:lvlText w:val=""/>
-      <w:lvlJc w:val="left"/>
-    </w:lvl>
-    <w:lvl w:ilvl="8" w:tplc="68724A6E">
-      <w:numFmt w:val="decimal"/>
-      <w:lvlText w:val=""/>
-      <w:lvlJc w:val="left"/>
-    </w:lvl>
-  </w:abstractNum>
-  <w:abstractNum w:abstractNumId="9" w15:restartNumberingAfterBreak="0">
-    <w:nsid w:val="7CAD4F07"/>
-    <w:multiLevelType w:val="hybridMultilevel"/>
-    <w:tmpl w:val="26BA33A8"/>
-    <w:lvl w:ilvl="0" w:tplc="0AA2336A">
-      <w:start w:val="1"/>
-      <w:numFmt w:val="decimal"/>
-      <w:lvlText w:val="%1."/>
-      <w:lvlJc w:val="left"/>
-      <w:pPr>
-        <w:ind w:left="360" w:hanging="300"/>
-      </w:pPr>
-    </w:lvl>
-    <w:lvl w:ilvl="1" w:tplc="B3B4B560" w:tentative="1">
-      <w:start w:val="1"/>
-      <w:numFmt w:val="lowerLetter"/>
-      <w:lvlText w:val="%2."/>
-      <w:lvlJc w:val="left"/>
-      <w:pPr>
-        <w:ind w:left="720" w:hanging="300"/>
-      </w:pPr>
-    </w:lvl>
-    <w:lvl w:ilvl="2" w:tplc="CCEE83BA">
-      <w:numFmt w:val="decimal"/>
-      <w:lvlText w:val=""/>
-      <w:lvlJc w:val="left"/>
-    </w:lvl>
-    <w:lvl w:ilvl="3" w:tplc="FB769BC8">
-      <w:numFmt w:val="decimal"/>
-      <w:lvlText w:val=""/>
-      <w:lvlJc w:val="left"/>
-    </w:lvl>
-    <w:lvl w:ilvl="4" w:tplc="E8C20D88">
-      <w:numFmt w:val="decimal"/>
-      <w:lvlText w:val=""/>
-      <w:lvlJc w:val="left"/>
-    </w:lvl>
-    <w:lvl w:ilvl="5" w:tplc="7C3EC136">
-      <w:numFmt w:val="decimal"/>
-      <w:lvlText w:val=""/>
-      <w:lvlJc w:val="left"/>
-    </w:lvl>
-    <w:lvl w:ilvl="6" w:tplc="A8B6B786">
-      <w:numFmt w:val="decimal"/>
-      <w:lvlText w:val=""/>
-      <w:lvlJc w:val="left"/>
-    </w:lvl>
-    <w:lvl w:ilvl="7" w:tplc="0D9430EE">
-      <w:numFmt w:val="decimal"/>
-      <w:lvlText w:val=""/>
-      <w:lvlJc w:val="left"/>
-    </w:lvl>
-    <w:lvl w:ilvl="8" w:tplc="64DCA2A4">
-      <w:numFmt w:val="decimal"/>
-      <w:lvlText w:val=""/>
-      <w:lvlJc w:val="left"/>
-    </w:lvl>
-  </w:abstractNum>
-  <w:num w:numId="1" w16cid:durableId="1210916996">
+  <w:num w:numId="1" w16cid:durableId="1674916541">
+    <w:abstractNumId w:val="9"/>
+    <w:lvlOverride w:ilvl="0">
+      <w:startOverride w:val="1"/>
+    </w:lvlOverride>
+  </w:num>
+  <w:num w:numId="2" w16cid:durableId="1235385639">
     <w:abstractNumId w:val="7"/>
     <w:lvlOverride w:ilvl="0">
       <w:startOverride w:val="1"/>
     </w:lvlOverride>
   </w:num>
-  <w:num w:numId="2" w16cid:durableId="19085123">
+  <w:num w:numId="3" w16cid:durableId="753861498">
+    <w:abstractNumId w:val="4"/>
+    <w:lvlOverride w:ilvl="0">
+      <w:startOverride w:val="1"/>
+    </w:lvlOverride>
+  </w:num>
+  <w:num w:numId="4" w16cid:durableId="2065907207">
+    <w:abstractNumId w:val="2"/>
+    <w:lvlOverride w:ilvl="0">
+      <w:startOverride w:val="1"/>
+    </w:lvlOverride>
+  </w:num>
+  <w:num w:numId="5" w16cid:durableId="1418749164">
+    <w:abstractNumId w:val="3"/>
+    <w:lvlOverride w:ilvl="0">
+      <w:startOverride w:val="1"/>
+    </w:lvlOverride>
+  </w:num>
+  <w:num w:numId="6" w16cid:durableId="78911677">
+    <w:abstractNumId w:val="5"/>
+    <w:lvlOverride w:ilvl="0">
+      <w:startOverride w:val="1"/>
+    </w:lvlOverride>
+  </w:num>
+  <w:num w:numId="7" w16cid:durableId="277219985">
+    <w:abstractNumId w:val="8"/>
+    <w:lvlOverride w:ilvl="0">
+      <w:startOverride w:val="1"/>
+    </w:lvlOverride>
+  </w:num>
+  <w:num w:numId="8" w16cid:durableId="123474448">
     <w:abstractNumId w:val="0"/>
     <w:lvlOverride w:ilvl="0">
       <w:startOverride w:val="1"/>
     </w:lvlOverride>
   </w:num>
-  <w:num w:numId="3" w16cid:durableId="595939766">
-    <w:abstractNumId w:val="8"/>
-    <w:lvlOverride w:ilvl="0">
-      <w:startOverride w:val="1"/>
-    </w:lvlOverride>
-  </w:num>
-  <w:num w:numId="4" w16cid:durableId="331613769">
-    <w:abstractNumId w:val="3"/>
-    <w:lvlOverride w:ilvl="0">
-      <w:startOverride w:val="1"/>
-    </w:lvlOverride>
-  </w:num>
-  <w:num w:numId="5" w16cid:durableId="4283586">
+  <w:num w:numId="9" w16cid:durableId="182091318">
     <w:abstractNumId w:val="6"/>
     <w:lvlOverride w:ilvl="0">
       <w:startOverride w:val="1"/>
     </w:lvlOverride>
   </w:num>
-  <w:num w:numId="6" w16cid:durableId="1697996861">
-    <w:abstractNumId w:val="2"/>
-    <w:lvlOverride w:ilvl="0">
-      <w:startOverride w:val="1"/>
-    </w:lvlOverride>
-  </w:num>
-  <w:num w:numId="7" w16cid:durableId="688146943">
-    <w:abstractNumId w:val="4"/>
-    <w:lvlOverride w:ilvl="0">
-      <w:startOverride w:val="1"/>
-    </w:lvlOverride>
-  </w:num>
-  <w:num w:numId="8" w16cid:durableId="8879196">
-    <w:abstractNumId w:val="5"/>
-    <w:lvlOverride w:ilvl="0">
-      <w:startOverride w:val="1"/>
-    </w:lvlOverride>
-  </w:num>
-  <w:num w:numId="9" w16cid:durableId="185944914">
-    <w:abstractNumId w:val="9"/>
-    <w:lvlOverride w:ilvl="0">
-      <w:startOverride w:val="1"/>
-    </w:lvlOverride>
-  </w:num>
-  <w:num w:numId="10" w16cid:durableId="260647974">
+  <w:num w:numId="10" w16cid:durableId="2004042651">
     <w:abstractNumId w:val="1"/>
     <w:lvlOverride w:ilvl="0">
       <w:startOverride w:val="1"/>
@@ -24150,7 +24150,7 @@
     <w:autoRedefine/>
     <w:uiPriority w:val="39"/>
     <w:unhideWhenUsed/>
-    <w:rsid w:val="0040225B"/>
+    <w:rsid w:val="00A03164"/>
     <w:pPr>
       <w:spacing w:after="100"/>
     </w:pPr>
@@ -24162,7 +24162,7 @@
     <w:autoRedefine/>
     <w:uiPriority w:val="39"/>
     <w:unhideWhenUsed/>
-    <w:rsid w:val="0040225B"/>
+    <w:rsid w:val="00A03164"/>
     <w:pPr>
       <w:spacing w:after="100"/>
       <w:ind w:left="210"/>

</xml_diff>